<commit_message>
Open Rules of Engagement with the owner's force-multiplier principle
Section 1 now opens with a pull-quote of David's guiding principle, supplied
in-session: "AI is a force multiplier. How can we use AI to solve faster,
smarter, and to scale?" Verbatim except one capital letter. One bridge
sentence links it to the standard and is flagged to the owner to keep or cut.

The seminar the note came from is recorded in the README, not the document,
per the principles-only decision. Pages 2-9 verified text-identical to the
prior render; two builds produce identical text; guard passes.

Co-Authored-By: Claude Opus 5.5 <noreply@anthropic.com>
Claude-Session: https://claude.ai/code/session_01AYc6fhZNmvyoAQ67RgbJuK
</commit_message>
<xml_diff>
--- a/results/2026-10-09/ai-rules-of-engagement/Rules-of-Engagement-Operational-AI_2026-10-09.docx
+++ b/results/2026-10-09/ai-rules-of-engagement/Rules-of-Engagement-Operational-AI_2026-10-09.docx
@@ -93,6 +93,54 @@
           <w:szCs w:val="30"/>
         </w:rPr>
         <w:t xml:space="preserve">1. Purpose</w:t>
+      </w:r>
+    </w:p>
+    <w:p>
+      <w:pPr>
+        <w:keepNext/>
+        <w:pBdr>
+          <w:left w:val="single" w:color="9EB3C5" w:sz="24" w:space="12"/>
+        </w:pBdr>
+        <w:spacing w:after="60" w:before="80" w:line="320"/>
+        <w:ind w:left="360" w:right="360"/>
+      </w:pPr>
+      <w:r>
+        <w:rPr>
+          <w:rFonts w:ascii="Eurostile" w:cs="Eurostile" w:eastAsia="Eurostile" w:hAnsi="Eurostile"/>
+          <w:color w:val="0F436E"/>
+          <w:sz w:val="28"/>
+          <w:szCs w:val="28"/>
+        </w:rPr>
+        <w:t xml:space="preserve">“AI is a force multiplier. How can we use AI to solve faster, smarter, and to scale?”</w:t>
+      </w:r>
+    </w:p>
+    <w:p>
+      <w:pPr>
+        <w:spacing w:after="200"/>
+        <w:ind w:left="360"/>
+      </w:pPr>
+      <w:r>
+        <w:rPr>
+          <w:rFonts w:ascii="Poppins" w:cs="Poppins" w:eastAsia="Poppins" w:hAnsi="Poppins"/>
+          <w:color w:val="4A4A4A"/>
+          <w:sz w:val="18"/>
+          <w:szCs w:val="18"/>
+        </w:rPr>
+        <w:t xml:space="preserve">— David Layson</w:t>
+      </w:r>
+    </w:p>
+    <w:p>
+      <w:pPr>
+        <w:spacing w:after="120" w:before="0" w:line="276"/>
+      </w:pPr>
+      <w:r>
+        <w:rPr>
+          <w:rFonts w:ascii="Poppins" w:cs="Poppins" w:eastAsia="Poppins" w:hAnsi="Poppins"/>
+          <w:color w:val="1A1A1A"/>
+          <w:sz w:val="20"/>
+          <w:szCs w:val="20"/>
+        </w:rPr>
+        <w:t xml:space="preserve">A multiplier works on whatever it is given. Applied to unverified output, it scales errors as fast as it scales value. This standard is how the multiplier gets applied to work that can be trusted.</w:t>
       </w:r>
     </w:p>
     <w:p>

</xml_diff>

<commit_message>
Add Section 2, Modernizing the Workflow, from the owner's notes
Built on David's notes: the four areas of context for an agent (Persona,
Task, Context, Format) with his project-manager example, and Workplace
Intelligence and Knowledge Base with his anchor question. He invited
elaboration; his wording is kept verbatim apart from two added articles.

The elaboration cites practice read this session: the draft-kit master brief
already uses all four parts, and its pull-first rule is the knowledge-base
discipline. One rule ("Access follows the person, not the tool") has no repo
basis and is flagged to the owner. Sections 2-7 renumbered to 3-8 with every
cross-reference updated; Appendix A and B gained rows. Source diff removes
only renumbered headings, cross-references, and one layout setting. Two
builds produce identical text; guard passes.

Co-Authored-By: Claude Opus 5.5 <noreply@anthropic.com>
Claude-Session: https://claude.ai/code/session_01AYc6fhZNmvyoAQ67RgbJuK
</commit_message>
<xml_diff>
--- a/results/2026-10-09/ai-rules-of-engagement/Rules-of-Engagement-Operational-AI_2026-10-09.docx
+++ b/results/2026-10-09/ai-rules-of-engagement/Rules-of-Engagement-Operational-AI_2026-10-09.docx
@@ -202,7 +202,7 @@
           <w:sz w:val="20"/>
           <w:szCs w:val="20"/>
         </w:rPr>
-        <w:t xml:space="preserve">Every rule here traces to a specific failure that occurred in real use and was then converted into a rule or a machine check. Appendix B lists the origin of each one. Section 7 states plainly which rules are measured and which are not yet proven.</w:t>
+        <w:t xml:space="preserve">Every rule here traces to a specific failure that occurred in real use and was then converted into a rule or a machine check. Appendix B lists the origin of each one. Section 8 states plainly which rules are measured and which are not yet proven.</w:t>
       </w:r>
     </w:p>
     <w:p>
@@ -271,7 +271,7 @@
                 <w:sz w:val="19"/>
                 <w:szCs w:val="19"/>
               </w:rPr>
-              <w:t xml:space="preserve">Section 2: the ten laws.  Section 3: the order of operations.  Section 4: the handshakes between the person and the AI.  Section 5: the machine-enforced controls.  Section 6: how the rules themselves are changed.  Section 7: evidence and honest status.  Appendix A: illustrative application to compliance and proposal work.</w:t>
+              <w:t xml:space="preserve">Section 2: modernizing the workflow.  Section 3: the ten laws.  Section 4: the order of operations.  Section 5: the handshakes between the person and the AI.  Section 6: the machine-enforced controls.  Section 7: how the rules themselves are changed.  Section 8: evidence and honest status.  Appendix A: illustrative application to compliance and proposal work.</w:t>
             </w:r>
           </w:p>
         </w:tc>
@@ -300,7 +300,931 @@
           <w:sz w:val="30"/>
           <w:szCs w:val="30"/>
         </w:rPr>
-        <w:t xml:space="preserve">2. The Ten Laws</w:t>
+        <w:t xml:space="preserve">2. Modernizing the Workflow</w:t>
+      </w:r>
+    </w:p>
+    <w:p>
+      <w:pPr>
+        <w:spacing w:after="120" w:before="0" w:line="276"/>
+      </w:pPr>
+      <w:r>
+        <w:rPr>
+          <w:rFonts w:ascii="Poppins" w:cs="Poppins" w:eastAsia="Poppins" w:hAnsi="Poppins"/>
+          <w:color w:val="1A1A1A"/>
+          <w:sz w:val="20"/>
+          <w:szCs w:val="20"/>
+        </w:rPr>
+        <w:t xml:space="preserve">A force multiplier needs aim. Two practices turn an AI assistant from a chat window into a working teammate: a structured brief for every task, and a knowledge base the AI searches before it answers.</w:t>
+      </w:r>
+    </w:p>
+    <w:p>
+      <w:pPr>
+        <w:pStyle w:val="Heading2"/>
+        <w:keepNext/>
+        <w:spacing w:after="80" w:before="200"/>
+      </w:pPr>
+      <w:r>
+        <w:rPr>
+          <w:rFonts w:ascii="Eurostile" w:cs="Eurostile" w:eastAsia="Eurostile" w:hAnsi="Eurostile"/>
+          <w:b/>
+          <w:bCs/>
+          <w:color w:val="0F436E"/>
+          <w:sz w:val="23"/>
+          <w:szCs w:val="23"/>
+        </w:rPr>
+        <w:t xml:space="preserve">The four-part brief</w:t>
+      </w:r>
+    </w:p>
+    <w:p>
+      <w:pPr>
+        <w:keepNext/>
+        <w:spacing w:after="120" w:before="0" w:line="276"/>
+      </w:pPr>
+      <w:r>
+        <w:rPr>
+          <w:rFonts w:ascii="Poppins" w:cs="Poppins" w:eastAsia="Poppins" w:hAnsi="Poppins"/>
+          <w:color w:val="1A1A1A"/>
+          <w:sz w:val="20"/>
+          <w:szCs w:val="20"/>
+        </w:rPr>
+        <w:t xml:space="preserve">Every task given to an AI agent carries four main areas of context. When one is missing, the model fills the gap with a guess, and the guess is invisible in the output.</w:t>
+      </w:r>
+    </w:p>
+    <w:tbl>
+      <w:tblPr>
+        <w:tblW w:type="dxa" w:w="9648"/>
+        <w:tblBorders>
+          <w:top w:val="single" w:color="auto" w:sz="4"/>
+          <w:left w:val="single" w:color="auto" w:sz="4"/>
+          <w:bottom w:val="single" w:color="auto" w:sz="4"/>
+          <w:right w:val="single" w:color="auto" w:sz="4"/>
+          <w:insideH w:val="single" w:color="auto" w:sz="4"/>
+          <w:insideV w:val="single" w:color="auto" w:sz="4"/>
+        </w:tblBorders>
+        <w:tblLayout w:type="fixed"/>
+      </w:tblPr>
+      <w:tblGrid>
+        <w:gridCol w:w="1500"/>
+        <w:gridCol w:w="4548"/>
+        <w:gridCol w:w="3600"/>
+      </w:tblGrid>
+      <w:tr>
+        <w:trPr>
+          <w:tblHeader/>
+        </w:trPr>
+        <w:tc>
+          <w:tcPr>
+            <w:tcW w:type="dxa" w:w="1500"/>
+            <w:tcBorders>
+              <w:top w:val="single" w:color="D9D9D9" w:sz="4"/>
+              <w:left w:val="single" w:color="D9D9D9" w:sz="4"/>
+              <w:bottom w:val="single" w:color="D9D9D9" w:sz="4"/>
+              <w:right w:val="single" w:color="D9D9D9" w:sz="4"/>
+            </w:tcBorders>
+            <w:shd w:fill="0F436E" w:color="auto" w:val="clear"/>
+            <w:tcMar>
+              <w:top w:type="dxa" w:w="70"/>
+              <w:left w:type="dxa" w:w="100"/>
+              <w:bottom w:type="dxa" w:w="50"/>
+              <w:right w:type="dxa" w:w="100"/>
+            </w:tcMar>
+          </w:tcPr>
+          <w:p>
+            <w:pPr>
+              <w:spacing w:after="40" w:line="252"/>
+            </w:pPr>
+            <w:r>
+              <w:rPr>
+                <w:rFonts w:ascii="Eurostile" w:cs="Eurostile" w:eastAsia="Eurostile" w:hAnsi="Eurostile"/>
+                <w:b/>
+                <w:bCs/>
+                <w:color w:val="FFFFFF"/>
+                <w:sz w:val="17"/>
+                <w:szCs w:val="17"/>
+              </w:rPr>
+              <w:t xml:space="preserve">Element</w:t>
+            </w:r>
+          </w:p>
+        </w:tc>
+        <w:tc>
+          <w:tcPr>
+            <w:tcW w:type="dxa" w:w="4548"/>
+            <w:tcBorders>
+              <w:top w:val="single" w:color="D9D9D9" w:sz="4"/>
+              <w:left w:val="single" w:color="D9D9D9" w:sz="4"/>
+              <w:bottom w:val="single" w:color="D9D9D9" w:sz="4"/>
+              <w:right w:val="single" w:color="D9D9D9" w:sz="4"/>
+            </w:tcBorders>
+            <w:shd w:fill="0F436E" w:color="auto" w:val="clear"/>
+            <w:tcMar>
+              <w:top w:type="dxa" w:w="70"/>
+              <w:left w:type="dxa" w:w="100"/>
+              <w:bottom w:type="dxa" w:w="50"/>
+              <w:right w:type="dxa" w:w="100"/>
+            </w:tcMar>
+          </w:tcPr>
+          <w:p>
+            <w:pPr>
+              <w:spacing w:after="40" w:line="252"/>
+            </w:pPr>
+            <w:r>
+              <w:rPr>
+                <w:rFonts w:ascii="Eurostile" w:cs="Eurostile" w:eastAsia="Eurostile" w:hAnsi="Eurostile"/>
+                <w:b/>
+                <w:bCs/>
+                <w:color w:val="FFFFFF"/>
+                <w:sz w:val="17"/>
+                <w:szCs w:val="17"/>
+              </w:rPr>
+              <w:t xml:space="preserve">What it supplies</w:t>
+            </w:r>
+          </w:p>
+        </w:tc>
+        <w:tc>
+          <w:tcPr>
+            <w:tcW w:type="dxa" w:w="3600"/>
+            <w:tcBorders>
+              <w:top w:val="single" w:color="D9D9D9" w:sz="4"/>
+              <w:left w:val="single" w:color="D9D9D9" w:sz="4"/>
+              <w:bottom w:val="single" w:color="D9D9D9" w:sz="4"/>
+              <w:right w:val="single" w:color="D9D9D9" w:sz="4"/>
+            </w:tcBorders>
+            <w:shd w:fill="0F436E" w:color="auto" w:val="clear"/>
+            <w:tcMar>
+              <w:top w:type="dxa" w:w="70"/>
+              <w:left w:type="dxa" w:w="100"/>
+              <w:bottom w:type="dxa" w:w="50"/>
+              <w:right w:type="dxa" w:w="100"/>
+            </w:tcMar>
+          </w:tcPr>
+          <w:p>
+            <w:pPr>
+              <w:spacing w:after="40" w:line="252"/>
+            </w:pPr>
+            <w:r>
+              <w:rPr>
+                <w:rFonts w:ascii="Eurostile" w:cs="Eurostile" w:eastAsia="Eurostile" w:hAnsi="Eurostile"/>
+                <w:b/>
+                <w:bCs/>
+                <w:color w:val="FFFFFF"/>
+                <w:sz w:val="17"/>
+                <w:szCs w:val="17"/>
+              </w:rPr>
+              <w:t xml:space="preserve">Example: a report to the CEO</w:t>
+            </w:r>
+          </w:p>
+        </w:tc>
+      </w:tr>
+      <w:tr>
+        <w:trPr>
+          <w:cantSplit/>
+        </w:trPr>
+        <w:tc>
+          <w:tcPr>
+            <w:tcW w:type="dxa" w:w="1500"/>
+            <w:tcBorders>
+              <w:top w:val="single" w:color="D9D9D9" w:sz="4"/>
+              <w:left w:val="single" w:color="D9D9D9" w:sz="4"/>
+              <w:bottom w:val="single" w:color="D9D9D9" w:sz="4"/>
+              <w:right w:val="single" w:color="D9D9D9" w:sz="4"/>
+            </w:tcBorders>
+            <w:tcMar>
+              <w:top w:type="dxa" w:w="70"/>
+              <w:left w:type="dxa" w:w="100"/>
+              <w:bottom w:type="dxa" w:w="50"/>
+              <w:right w:type="dxa" w:w="100"/>
+            </w:tcMar>
+          </w:tcPr>
+          <w:p>
+            <w:pPr>
+              <w:spacing w:after="40" w:line="252"/>
+            </w:pPr>
+            <w:r>
+              <w:rPr>
+                <w:rFonts w:ascii="Poppins" w:cs="Poppins" w:eastAsia="Poppins" w:hAnsi="Poppins"/>
+                <w:b/>
+                <w:bCs/>
+                <w:color w:val="1A1A1A"/>
+                <w:sz w:val="17"/>
+                <w:szCs w:val="17"/>
+              </w:rPr>
+              <w:t xml:space="preserve">Persona</w:t>
+            </w:r>
+          </w:p>
+        </w:tc>
+        <w:tc>
+          <w:tcPr>
+            <w:tcW w:type="dxa" w:w="4548"/>
+            <w:tcBorders>
+              <w:top w:val="single" w:color="D9D9D9" w:sz="4"/>
+              <w:left w:val="single" w:color="D9D9D9" w:sz="4"/>
+              <w:bottom w:val="single" w:color="D9D9D9" w:sz="4"/>
+              <w:right w:val="single" w:color="D9D9D9" w:sz="4"/>
+            </w:tcBorders>
+            <w:tcMar>
+              <w:top w:type="dxa" w:w="70"/>
+              <w:left w:type="dxa" w:w="100"/>
+              <w:bottom w:type="dxa" w:w="50"/>
+              <w:right w:type="dxa" w:w="100"/>
+            </w:tcMar>
+          </w:tcPr>
+          <w:p>
+            <w:pPr>
+              <w:spacing w:after="40" w:line="252"/>
+            </w:pPr>
+            <w:r>
+              <w:rPr>
+                <w:rFonts w:ascii="Poppins" w:cs="Poppins" w:eastAsia="Poppins" w:hAnsi="Poppins"/>
+                <w:b w:val="false"/>
+                <w:bCs w:val="false"/>
+                <w:color w:val="1A1A1A"/>
+                <w:sz w:val="17"/>
+                <w:szCs w:val="17"/>
+              </w:rPr>
+              <w:t xml:space="preserve">The role, expertise, and standards the AI applies. A persona sets judgment. It never licenses a claim the AI cannot support.</w:t>
+            </w:r>
+          </w:p>
+        </w:tc>
+        <w:tc>
+          <w:tcPr>
+            <w:tcW w:type="dxa" w:w="3600"/>
+            <w:tcBorders>
+              <w:top w:val="single" w:color="D9D9D9" w:sz="4"/>
+              <w:left w:val="single" w:color="D9D9D9" w:sz="4"/>
+              <w:bottom w:val="single" w:color="D9D9D9" w:sz="4"/>
+              <w:right w:val="single" w:color="D9D9D9" w:sz="4"/>
+            </w:tcBorders>
+            <w:tcMar>
+              <w:top w:type="dxa" w:w="70"/>
+              <w:left w:type="dxa" w:w="100"/>
+              <w:bottom w:type="dxa" w:w="50"/>
+              <w:right w:type="dxa" w:w="100"/>
+            </w:tcMar>
+          </w:tcPr>
+          <w:p>
+            <w:pPr>
+              <w:spacing w:after="40" w:line="252"/>
+            </w:pPr>
+            <w:r>
+              <w:rPr>
+                <w:rFonts w:ascii="Poppins" w:cs="Poppins" w:eastAsia="Poppins" w:hAnsi="Poppins"/>
+                <w:b w:val="false"/>
+                <w:bCs w:val="false"/>
+                <w:color w:val="1A1A1A"/>
+                <w:sz w:val="17"/>
+                <w:szCs w:val="17"/>
+              </w:rPr>
+              <w:t xml:space="preserve">“You are a project manager…”</w:t>
+            </w:r>
+          </w:p>
+        </w:tc>
+      </w:tr>
+      <w:tr>
+        <w:trPr>
+          <w:cantSplit/>
+        </w:trPr>
+        <w:tc>
+          <w:tcPr>
+            <w:tcW w:type="dxa" w:w="1500"/>
+            <w:tcBorders>
+              <w:top w:val="single" w:color="D9D9D9" w:sz="4"/>
+              <w:left w:val="single" w:color="D9D9D9" w:sz="4"/>
+              <w:bottom w:val="single" w:color="D9D9D9" w:sz="4"/>
+              <w:right w:val="single" w:color="D9D9D9" w:sz="4"/>
+            </w:tcBorders>
+            <w:shd w:fill="F6F8FA" w:color="auto" w:val="clear"/>
+            <w:tcMar>
+              <w:top w:type="dxa" w:w="70"/>
+              <w:left w:type="dxa" w:w="100"/>
+              <w:bottom w:type="dxa" w:w="50"/>
+              <w:right w:type="dxa" w:w="100"/>
+            </w:tcMar>
+          </w:tcPr>
+          <w:p>
+            <w:pPr>
+              <w:spacing w:after="40" w:line="252"/>
+            </w:pPr>
+            <w:r>
+              <w:rPr>
+                <w:rFonts w:ascii="Poppins" w:cs="Poppins" w:eastAsia="Poppins" w:hAnsi="Poppins"/>
+                <w:b/>
+                <w:bCs/>
+                <w:color w:val="1A1A1A"/>
+                <w:sz w:val="17"/>
+                <w:szCs w:val="17"/>
+              </w:rPr>
+              <w:t xml:space="preserve">Task</w:t>
+            </w:r>
+          </w:p>
+        </w:tc>
+        <w:tc>
+          <w:tcPr>
+            <w:tcW w:type="dxa" w:w="4548"/>
+            <w:tcBorders>
+              <w:top w:val="single" w:color="D9D9D9" w:sz="4"/>
+              <w:left w:val="single" w:color="D9D9D9" w:sz="4"/>
+              <w:bottom w:val="single" w:color="D9D9D9" w:sz="4"/>
+              <w:right w:val="single" w:color="D9D9D9" w:sz="4"/>
+            </w:tcBorders>
+            <w:shd w:fill="F6F8FA" w:color="auto" w:val="clear"/>
+            <w:tcMar>
+              <w:top w:type="dxa" w:w="70"/>
+              <w:left w:type="dxa" w:w="100"/>
+              <w:bottom w:type="dxa" w:w="50"/>
+              <w:right w:type="dxa" w:w="100"/>
+            </w:tcMar>
+          </w:tcPr>
+          <w:p>
+            <w:pPr>
+              <w:spacing w:after="40" w:line="252"/>
+            </w:pPr>
+            <w:r>
+              <w:rPr>
+                <w:rFonts w:ascii="Poppins" w:cs="Poppins" w:eastAsia="Poppins" w:hAnsi="Poppins"/>
+                <w:b w:val="false"/>
+                <w:bCs w:val="false"/>
+                <w:color w:val="1A1A1A"/>
+                <w:sz w:val="17"/>
+                <w:szCs w:val="17"/>
+              </w:rPr>
+              <w:t xml:space="preserve">The deliverable and the decision it serves, stated so that success or failure is checkable.</w:t>
+            </w:r>
+          </w:p>
+        </w:tc>
+        <w:tc>
+          <w:tcPr>
+            <w:tcW w:type="dxa" w:w="3600"/>
+            <w:tcBorders>
+              <w:top w:val="single" w:color="D9D9D9" w:sz="4"/>
+              <w:left w:val="single" w:color="D9D9D9" w:sz="4"/>
+              <w:bottom w:val="single" w:color="D9D9D9" w:sz="4"/>
+              <w:right w:val="single" w:color="D9D9D9" w:sz="4"/>
+            </w:tcBorders>
+            <w:shd w:fill="F6F8FA" w:color="auto" w:val="clear"/>
+            <w:tcMar>
+              <w:top w:type="dxa" w:w="70"/>
+              <w:left w:type="dxa" w:w="100"/>
+              <w:bottom w:type="dxa" w:w="50"/>
+              <w:right w:type="dxa" w:w="100"/>
+            </w:tcMar>
+          </w:tcPr>
+          <w:p>
+            <w:pPr>
+              <w:spacing w:after="40" w:line="252"/>
+            </w:pPr>
+            <w:r>
+              <w:rPr>
+                <w:rFonts w:ascii="Poppins" w:cs="Poppins" w:eastAsia="Poppins" w:hAnsi="Poppins"/>
+                <w:b w:val="false"/>
+                <w:bCs w:val="false"/>
+                <w:color w:val="1A1A1A"/>
+                <w:sz w:val="17"/>
+                <w:szCs w:val="17"/>
+              </w:rPr>
+              <w:t xml:space="preserve">Delivering a report to the CEO, so the CEO can decide whether to add resources this quarter</w:t>
+            </w:r>
+          </w:p>
+        </w:tc>
+      </w:tr>
+      <w:tr>
+        <w:trPr>
+          <w:cantSplit/>
+        </w:trPr>
+        <w:tc>
+          <w:tcPr>
+            <w:tcW w:type="dxa" w:w="1500"/>
+            <w:tcBorders>
+              <w:top w:val="single" w:color="D9D9D9" w:sz="4"/>
+              <w:left w:val="single" w:color="D9D9D9" w:sz="4"/>
+              <w:bottom w:val="single" w:color="D9D9D9" w:sz="4"/>
+              <w:right w:val="single" w:color="D9D9D9" w:sz="4"/>
+            </w:tcBorders>
+            <w:tcMar>
+              <w:top w:type="dxa" w:w="70"/>
+              <w:left w:type="dxa" w:w="100"/>
+              <w:bottom w:type="dxa" w:w="50"/>
+              <w:right w:type="dxa" w:w="100"/>
+            </w:tcMar>
+          </w:tcPr>
+          <w:p>
+            <w:pPr>
+              <w:spacing w:after="40" w:line="252"/>
+            </w:pPr>
+            <w:r>
+              <w:rPr>
+                <w:rFonts w:ascii="Poppins" w:cs="Poppins" w:eastAsia="Poppins" w:hAnsi="Poppins"/>
+                <w:b/>
+                <w:bCs/>
+                <w:color w:val="1A1A1A"/>
+                <w:sz w:val="17"/>
+                <w:szCs w:val="17"/>
+              </w:rPr>
+              <w:t xml:space="preserve">Context</w:t>
+            </w:r>
+          </w:p>
+        </w:tc>
+        <w:tc>
+          <w:tcPr>
+            <w:tcW w:type="dxa" w:w="4548"/>
+            <w:tcBorders>
+              <w:top w:val="single" w:color="D9D9D9" w:sz="4"/>
+              <w:left w:val="single" w:color="D9D9D9" w:sz="4"/>
+              <w:bottom w:val="single" w:color="D9D9D9" w:sz="4"/>
+              <w:right w:val="single" w:color="D9D9D9" w:sz="4"/>
+            </w:tcBorders>
+            <w:tcMar>
+              <w:top w:type="dxa" w:w="70"/>
+              <w:left w:type="dxa" w:w="100"/>
+              <w:bottom w:type="dxa" w:w="50"/>
+              <w:right w:type="dxa" w:w="100"/>
+            </w:tcMar>
+          </w:tcPr>
+          <w:p>
+            <w:pPr>
+              <w:spacing w:after="40" w:line="252"/>
+            </w:pPr>
+            <w:r>
+              <w:rPr>
+                <w:rFonts w:ascii="Poppins" w:cs="Poppins" w:eastAsia="Poppins" w:hAnsi="Poppins"/>
+                <w:b w:val="false"/>
+                <w:bCs w:val="false"/>
+                <w:color w:val="1A1A1A"/>
+                <w:sz w:val="17"/>
+                <w:szCs w:val="17"/>
+              </w:rPr>
+              <w:t xml:space="preserve">The facts, documents, constraints, and audience the AI cannot infer. A missing fact becomes a named assumption, never a silent default (Law L7).</w:t>
+            </w:r>
+          </w:p>
+        </w:tc>
+        <w:tc>
+          <w:tcPr>
+            <w:tcW w:type="dxa" w:w="3600"/>
+            <w:tcBorders>
+              <w:top w:val="single" w:color="D9D9D9" w:sz="4"/>
+              <w:left w:val="single" w:color="D9D9D9" w:sz="4"/>
+              <w:bottom w:val="single" w:color="D9D9D9" w:sz="4"/>
+              <w:right w:val="single" w:color="D9D9D9" w:sz="4"/>
+            </w:tcBorders>
+            <w:tcMar>
+              <w:top w:type="dxa" w:w="70"/>
+              <w:left w:type="dxa" w:w="100"/>
+              <w:bottom w:type="dxa" w:w="50"/>
+              <w:right w:type="dxa" w:w="100"/>
+            </w:tcMar>
+          </w:tcPr>
+          <w:p>
+            <w:pPr>
+              <w:spacing w:after="40" w:line="252"/>
+            </w:pPr>
+            <w:r>
+              <w:rPr>
+                <w:rFonts w:ascii="Poppins" w:cs="Poppins" w:eastAsia="Poppins" w:hAnsi="Poppins"/>
+                <w:b w:val="false"/>
+                <w:bCs w:val="false"/>
+                <w:color w:val="1A1A1A"/>
+                <w:sz w:val="17"/>
+                <w:szCs w:val="17"/>
+              </w:rPr>
+              <w:t xml:space="preserve">The current schedule, the last three status reports, the open risk register, and the CEO's stated priorities</w:t>
+            </w:r>
+          </w:p>
+        </w:tc>
+      </w:tr>
+      <w:tr>
+        <w:trPr>
+          <w:cantSplit/>
+        </w:trPr>
+        <w:tc>
+          <w:tcPr>
+            <w:tcW w:type="dxa" w:w="1500"/>
+            <w:tcBorders>
+              <w:top w:val="single" w:color="D9D9D9" w:sz="4"/>
+              <w:left w:val="single" w:color="D9D9D9" w:sz="4"/>
+              <w:bottom w:val="single" w:color="D9D9D9" w:sz="4"/>
+              <w:right w:val="single" w:color="D9D9D9" w:sz="4"/>
+            </w:tcBorders>
+            <w:shd w:fill="F6F8FA" w:color="auto" w:val="clear"/>
+            <w:tcMar>
+              <w:top w:type="dxa" w:w="70"/>
+              <w:left w:type="dxa" w:w="100"/>
+              <w:bottom w:type="dxa" w:w="50"/>
+              <w:right w:type="dxa" w:w="100"/>
+            </w:tcMar>
+          </w:tcPr>
+          <w:p>
+            <w:pPr>
+              <w:spacing w:after="40" w:line="252"/>
+            </w:pPr>
+            <w:r>
+              <w:rPr>
+                <w:rFonts w:ascii="Poppins" w:cs="Poppins" w:eastAsia="Poppins" w:hAnsi="Poppins"/>
+                <w:b/>
+                <w:bCs/>
+                <w:color w:val="1A1A1A"/>
+                <w:sz w:val="17"/>
+                <w:szCs w:val="17"/>
+              </w:rPr>
+              <w:t xml:space="preserve">Format</w:t>
+            </w:r>
+          </w:p>
+        </w:tc>
+        <w:tc>
+          <w:tcPr>
+            <w:tcW w:type="dxa" w:w="4548"/>
+            <w:tcBorders>
+              <w:top w:val="single" w:color="D9D9D9" w:sz="4"/>
+              <w:left w:val="single" w:color="D9D9D9" w:sz="4"/>
+              <w:bottom w:val="single" w:color="D9D9D9" w:sz="4"/>
+              <w:right w:val="single" w:color="D9D9D9" w:sz="4"/>
+            </w:tcBorders>
+            <w:shd w:fill="F6F8FA" w:color="auto" w:val="clear"/>
+            <w:tcMar>
+              <w:top w:type="dxa" w:w="70"/>
+              <w:left w:type="dxa" w:w="100"/>
+              <w:bottom w:type="dxa" w:w="50"/>
+              <w:right w:type="dxa" w:w="100"/>
+            </w:tcMar>
+          </w:tcPr>
+          <w:p>
+            <w:pPr>
+              <w:spacing w:after="40" w:line="252"/>
+            </w:pPr>
+            <w:r>
+              <w:rPr>
+                <w:rFonts w:ascii="Poppins" w:cs="Poppins" w:eastAsia="Poppins" w:hAnsi="Poppins"/>
+                <w:b w:val="false"/>
+                <w:bCs w:val="false"/>
+                <w:color w:val="1A1A1A"/>
+                <w:sz w:val="17"/>
+                <w:szCs w:val="17"/>
+              </w:rPr>
+              <w:t xml:space="preserve">The shape of the output: length, structure, sections, and file type. A format fixed in advance is checkable at delivery.</w:t>
+            </w:r>
+          </w:p>
+        </w:tc>
+        <w:tc>
+          <w:tcPr>
+            <w:tcW w:type="dxa" w:w="3600"/>
+            <w:tcBorders>
+              <w:top w:val="single" w:color="D9D9D9" w:sz="4"/>
+              <w:left w:val="single" w:color="D9D9D9" w:sz="4"/>
+              <w:bottom w:val="single" w:color="D9D9D9" w:sz="4"/>
+              <w:right w:val="single" w:color="D9D9D9" w:sz="4"/>
+            </w:tcBorders>
+            <w:shd w:fill="F6F8FA" w:color="auto" w:val="clear"/>
+            <w:tcMar>
+              <w:top w:type="dxa" w:w="70"/>
+              <w:left w:type="dxa" w:w="100"/>
+              <w:bottom w:type="dxa" w:w="50"/>
+              <w:right w:type="dxa" w:w="100"/>
+            </w:tcMar>
+          </w:tcPr>
+          <w:p>
+            <w:pPr>
+              <w:spacing w:after="40" w:line="252"/>
+            </w:pPr>
+            <w:r>
+              <w:rPr>
+                <w:rFonts w:ascii="Poppins" w:cs="Poppins" w:eastAsia="Poppins" w:hAnsi="Poppins"/>
+                <w:b w:val="false"/>
+                <w:bCs w:val="false"/>
+                <w:color w:val="1A1A1A"/>
+                <w:sz w:val="17"/>
+                <w:szCs w:val="17"/>
+              </w:rPr>
+              <w:t xml:space="preserve">One page: the decision needed, status, the top three risks with owners, and a recommendation</w:t>
+            </w:r>
+          </w:p>
+        </w:tc>
+      </w:tr>
+    </w:tbl>
+    <w:p>
+      <w:pPr>
+        <w:spacing w:after="120" w:before="120" w:line="276"/>
+      </w:pPr>
+      <w:r>
+        <w:rPr>
+          <w:rFonts w:ascii="Poppins" w:cs="Poppins" w:eastAsia="Poppins" w:hAnsi="Poppins"/>
+          <w:b/>
+          <w:bCs/>
+          <w:color w:val="1A1A1A"/>
+          <w:sz w:val="20"/>
+          <w:szCs w:val="20"/>
+        </w:rPr>
+        <w:t xml:space="preserve">In practice.</w:t>
+      </w:r>
+      <w:r>
+        <w:rPr>
+          <w:rFonts w:ascii="Poppins" w:cs="Poppins" w:eastAsia="Poppins" w:hAnsi="Poppins"/>
+          <w:color w:val="1A1A1A"/>
+          <w:sz w:val="20"/>
+          <w:szCs w:val="20"/>
+        </w:rPr>
+        <w:t xml:space="preserve"> The master brief behind the research system described in Section 8 is built on these four parts. It opens with a persona (“You are an expert … analyst”), states one task and the decision it serves, reads its context from a fill-in inputs file and a dated baseline, and specifies the deliverable's required sections in order. Inputs left blank are never guessed. Each takes a stated default and is listed in the report as a numbered assumption the reader can correct.</w:t>
+      </w:r>
+    </w:p>
+    <w:p>
+      <w:pPr>
+        <w:spacing w:after="120" w:before="0" w:line="276"/>
+      </w:pPr>
+      <w:r>
+        <w:rPr>
+          <w:rFonts w:ascii="Poppins" w:cs="Poppins" w:eastAsia="Poppins" w:hAnsi="Poppins"/>
+          <w:color w:val="1A1A1A"/>
+          <w:sz w:val="20"/>
+          <w:szCs w:val="20"/>
+        </w:rPr>
+        <w:t xml:space="preserve">The brief is the input to Step 1 of the order of operations (Section 4). The plan gate restates it as a goal that could fail, an assumption register, and success criteria, and shows that back to the person before any work starts.</w:t>
+      </w:r>
+    </w:p>
+    <w:p>
+      <w:pPr>
+        <w:pStyle w:val="Heading2"/>
+        <w:keepNext/>
+        <w:spacing w:after="80" w:before="200"/>
+      </w:pPr>
+      <w:r>
+        <w:rPr>
+          <w:rFonts w:ascii="Eurostile" w:cs="Eurostile" w:eastAsia="Eurostile" w:hAnsi="Eurostile"/>
+          <w:b/>
+          <w:bCs/>
+          <w:color w:val="0F436E"/>
+          <w:sz w:val="23"/>
+          <w:szCs w:val="23"/>
+        </w:rPr>
+        <w:t xml:space="preserve">Workplace Intelligence and Knowledge Base</w:t>
+      </w:r>
+    </w:p>
+    <w:tbl>
+      <w:tblPr>
+        <w:tblW w:type="dxa" w:w="9648"/>
+        <w:tblBorders>
+          <w:top w:val="single" w:color="auto" w:sz="4"/>
+          <w:left w:val="single" w:color="auto" w:sz="4"/>
+          <w:bottom w:val="single" w:color="auto" w:sz="4"/>
+          <w:right w:val="single" w:color="auto" w:sz="4"/>
+          <w:insideH w:val="single" w:color="auto" w:sz="4"/>
+          <w:insideV w:val="single" w:color="auto" w:sz="4"/>
+        </w:tblBorders>
+        <w:tblLayout w:type="fixed"/>
+      </w:tblPr>
+      <w:tblGrid>
+        <w:gridCol w:w="9648"/>
+      </w:tblGrid>
+      <w:tr>
+        <w:tc>
+          <w:tcPr>
+            <w:tcW w:type="dxa" w:w="9648"/>
+            <w:tcBorders>
+              <w:top w:val="none" w:color="FFFFFF" w:sz="0"/>
+              <w:left w:val="single" w:color="0F436E" w:sz="24"/>
+              <w:bottom w:val="none" w:color="FFFFFF" w:sz="0"/>
+              <w:right w:val="none" w:color="FFFFFF" w:sz="0"/>
+            </w:tcBorders>
+            <w:shd w:fill="EEF2F6" w:color="auto" w:val="clear"/>
+            <w:tcMar>
+              <w:top w:type="dxa" w:w="120"/>
+              <w:left w:type="dxa" w:w="200"/>
+              <w:bottom w:type="dxa" w:w="80"/>
+              <w:right w:type="dxa" w:w="200"/>
+            </w:tcMar>
+          </w:tcPr>
+          <w:p>
+            <w:pPr>
+              <w:spacing w:after="60" w:line="264"/>
+            </w:pPr>
+            <w:r>
+              <w:rPr>
+                <w:rFonts w:ascii="Poppins" w:cs="Poppins" w:eastAsia="Poppins" w:hAnsi="Poppins"/>
+                <w:b/>
+                <w:bCs/>
+                <w:color w:val="1A1A1A"/>
+                <w:sz w:val="19"/>
+                <w:szCs w:val="19"/>
+              </w:rPr>
+              <w:t xml:space="preserve">The anchor question:</w:t>
+            </w:r>
+            <w:r>
+              <w:rPr>
+                <w:rFonts w:ascii="Poppins" w:cs="Poppins" w:eastAsia="Poppins" w:hAnsi="Poppins"/>
+                <w:color w:val="1A1A1A"/>
+                <w:sz w:val="19"/>
+                <w:szCs w:val="19"/>
+              </w:rPr>
+              <w:t xml:space="preserve">  “What are all the documents I have on ___ topic?”</w:t>
+            </w:r>
+          </w:p>
+        </w:tc>
+      </w:tr>
+    </w:tbl>
+    <w:p>
+      <w:pPr>
+        <w:spacing w:after="120" w:before="120" w:line="276"/>
+      </w:pPr>
+      <w:r>
+        <w:rPr>
+          <w:rFonts w:ascii="Poppins" w:cs="Poppins" w:eastAsia="Poppins" w:hAnsi="Poppins"/>
+          <w:color w:val="1A1A1A"/>
+          <w:sz w:val="20"/>
+          <w:szCs w:val="20"/>
+        </w:rPr>
+        <w:t xml:space="preserve">Often the most valuable request is not “write me something” but “what do we already know?” A knowledge base lets the AI answer from the organization's own records, such as past work, policies, and lessons learned, instead of from its training data. It replaces recall with records, which is the core defense in Laws L1 and L5. Five rules make it trustworthy.</w:t>
+      </w:r>
+    </w:p>
+    <w:p>
+      <w:pPr>
+        <w:pStyle w:val="ListParagraph"/>
+        <w:numPr>
+          <w:ilvl w:val="0"/>
+          <w:numId w:val="2"/>
+        </w:numPr>
+        <w:spacing w:after="70" w:line="264"/>
+      </w:pPr>
+      <w:r>
+        <w:rPr>
+          <w:rFonts w:ascii="Poppins" w:cs="Poppins" w:eastAsia="Poppins" w:hAnsi="Poppins"/>
+          <w:b/>
+          <w:bCs/>
+          <w:color w:val="1A1A1A"/>
+          <w:sz w:val="20"/>
+          <w:szCs w:val="20"/>
+        </w:rPr>
+        <w:t xml:space="preserve">Answers cite the record.</w:t>
+      </w:r>
+      <w:r>
+        <w:rPr>
+          <w:rFonts w:ascii="Poppins" w:cs="Poppins" w:eastAsia="Poppins" w:hAnsi="Poppins"/>
+          <w:color w:val="1A1A1A"/>
+          <w:sz w:val="20"/>
+          <w:szCs w:val="20"/>
+        </w:rPr>
+        <w:t xml:space="preserve"> Every document named in an answer is one the AI retrieved in the session, with its title, date, and location.</w:t>
+      </w:r>
+    </w:p>
+    <w:p>
+      <w:pPr>
+        <w:pStyle w:val="ListParagraph"/>
+        <w:numPr>
+          <w:ilvl w:val="0"/>
+          <w:numId w:val="2"/>
+        </w:numPr>
+        <w:spacing w:after="70" w:line="264"/>
+      </w:pPr>
+      <w:r>
+        <w:rPr>
+          <w:rFonts w:ascii="Poppins" w:cs="Poppins" w:eastAsia="Poppins" w:hAnsi="Poppins"/>
+          <w:b/>
+          <w:bCs/>
+          <w:color w:val="1A1A1A"/>
+          <w:sz w:val="20"/>
+          <w:szCs w:val="20"/>
+        </w:rPr>
+        <w:t xml:space="preserve">Coverage is stated.</w:t>
+      </w:r>
+      <w:r>
+        <w:rPr>
+          <w:rFonts w:ascii="Poppins" w:cs="Poppins" w:eastAsia="Poppins" w:hAnsi="Poppins"/>
+          <w:color w:val="1A1A1A"/>
+          <w:sz w:val="20"/>
+          <w:szCs w:val="20"/>
+        </w:rPr>
+        <w:t xml:space="preserve"> An answer to “what do we have on this?” names the collections searched and any it could not reach. “Nothing found” is valid only with the search shown (Law L4).</w:t>
+      </w:r>
+    </w:p>
+    <w:p>
+      <w:pPr>
+        <w:pStyle w:val="ListParagraph"/>
+        <w:numPr>
+          <w:ilvl w:val="0"/>
+          <w:numId w:val="2"/>
+        </w:numPr>
+        <w:spacing w:after="70" w:line="264"/>
+      </w:pPr>
+      <w:r>
+        <w:rPr>
+          <w:rFonts w:ascii="Poppins" w:cs="Poppins" w:eastAsia="Poppins" w:hAnsi="Poppins"/>
+          <w:b/>
+          <w:bCs/>
+          <w:color w:val="1A1A1A"/>
+          <w:sz w:val="20"/>
+          <w:szCs w:val="20"/>
+        </w:rPr>
+        <w:t xml:space="preserve">Live sources outrank stored copies.</w:t>
+      </w:r>
+      <w:r>
+        <w:rPr>
+          <w:rFonts w:ascii="Poppins" w:cs="Poppins" w:eastAsia="Poppins" w:hAnsi="Poppins"/>
+          <w:color w:val="1A1A1A"/>
+          <w:sz w:val="20"/>
+          <w:szCs w:val="20"/>
+        </w:rPr>
+        <w:t xml:space="preserve"> A stored snapshot is treated as possibly stale. When a live source contradicts it, the live source wins and the conflict is flagged in one line, never resolved silently.</w:t>
+      </w:r>
+    </w:p>
+    <w:p>
+      <w:pPr>
+        <w:pStyle w:val="ListParagraph"/>
+        <w:numPr>
+          <w:ilvl w:val="0"/>
+          <w:numId w:val="2"/>
+        </w:numPr>
+        <w:spacing w:after="70" w:line="264"/>
+      </w:pPr>
+      <w:r>
+        <w:rPr>
+          <w:rFonts w:ascii="Poppins" w:cs="Poppins" w:eastAsia="Poppins" w:hAnsi="Poppins"/>
+          <w:b/>
+          <w:bCs/>
+          <w:color w:val="1A1A1A"/>
+          <w:sz w:val="20"/>
+          <w:szCs w:val="20"/>
+        </w:rPr>
+        <w:t xml:space="preserve">The record is the memory.</w:t>
+      </w:r>
+      <w:r>
+        <w:rPr>
+          <w:rFonts w:ascii="Poppins" w:cs="Poppins" w:eastAsia="Poppins" w:hAnsi="Poppins"/>
+          <w:color w:val="1A1A1A"/>
+          <w:sz w:val="20"/>
+          <w:szCs w:val="20"/>
+        </w:rPr>
+        <w:t xml:space="preserve"> Work that is not saved back to the knowledge base does not exist for the next session or the next person (Handshake H10).</w:t>
+      </w:r>
+    </w:p>
+    <w:p>
+      <w:pPr>
+        <w:pStyle w:val="ListParagraph"/>
+        <w:numPr>
+          <w:ilvl w:val="0"/>
+          <w:numId w:val="2"/>
+        </w:numPr>
+        <w:spacing w:after="70" w:line="264"/>
+      </w:pPr>
+      <w:r>
+        <w:rPr>
+          <w:rFonts w:ascii="Poppins" w:cs="Poppins" w:eastAsia="Poppins" w:hAnsi="Poppins"/>
+          <w:b/>
+          <w:bCs/>
+          <w:color w:val="1A1A1A"/>
+          <w:sz w:val="20"/>
+          <w:szCs w:val="20"/>
+        </w:rPr>
+        <w:t xml:space="preserve">Access follows the person, not the tool.</w:t>
+      </w:r>
+      <w:r>
+        <w:rPr>
+          <w:rFonts w:ascii="Poppins" w:cs="Poppins" w:eastAsia="Poppins" w:hAnsi="Poppins"/>
+          <w:color w:val="1A1A1A"/>
+          <w:sz w:val="20"/>
+          <w:szCs w:val="20"/>
+        </w:rPr>
+        <w:t xml:space="preserve"> The AI retrieves only what the person asking is permitted to see.</w:t>
+      </w:r>
+    </w:p>
+    <w:p>
+      <w:pPr>
+        <w:spacing w:after="120" w:before="120" w:line="276"/>
+      </w:pPr>
+      <w:r>
+        <w:rPr>
+          <w:rFonts w:ascii="Poppins" w:cs="Poppins" w:eastAsia="Poppins" w:hAnsi="Poppins"/>
+          <w:b/>
+          <w:bCs/>
+          <w:color w:val="1A1A1A"/>
+          <w:sz w:val="20"/>
+          <w:szCs w:val="20"/>
+        </w:rPr>
+        <w:t xml:space="preserve">In practice.</w:t>
+      </w:r>
+      <w:r>
+        <w:rPr>
+          <w:rFonts w:ascii="Poppins" w:cs="Poppins" w:eastAsia="Poppins" w:hAnsi="Poppins"/>
+          <w:color w:val="1A1A1A"/>
+          <w:sz w:val="20"/>
+          <w:szCs w:val="20"/>
+        </w:rPr>
+        <w:t xml:space="preserve"> The research system treats its stored project files as a snapshot that is stale by default. Its pull-first rule fetches the live record before answering, labels any fallback to the snapshot as possibly stale, and resolves every conflict toward the live record with a one-line flag.</w:t>
+      </w:r>
+    </w:p>
+    <w:p>
+      <w:pPr>
+        <w:pStyle w:val="Heading1"/>
+        <w:keepNext/>
+        <w:pBdr>
+          <w:bottom w:val="single" w:color="9EB3C5" w:sz="8" w:space="4"/>
+        </w:pBdr>
+        <w:spacing w:after="100" w:before="280"/>
+      </w:pPr>
+      <w:r>
+        <w:rPr>
+          <w:rFonts w:ascii="Eurostile" w:cs="Eurostile" w:eastAsia="Eurostile" w:hAnsi="Eurostile"/>
+          <w:b/>
+          <w:bCs/>
+          <w:color w:val="0F436E"/>
+          <w:sz w:val="30"/>
+          <w:szCs w:val="30"/>
+        </w:rPr>
+        <w:t xml:space="preserve">3. The Ten Laws</w:t>
       </w:r>
     </w:p>
     <w:p>
@@ -1626,7 +2550,7 @@
           <w:sz w:val="30"/>
           <w:szCs w:val="30"/>
         </w:rPr>
-        <w:t xml:space="preserve">3. Order of Operations</w:t>
+        <w:t xml:space="preserve">4. Order of Operations</w:t>
       </w:r>
     </w:p>
     <w:p>
@@ -2223,7 +3147,7 @@
                 <w:sz w:val="17"/>
                 <w:szCs w:val="17"/>
               </w:rPr>
-              <w:t xml:space="preserve">Every input the work depends on is verified fresh; a freshness card (Section 4, H1)</w:t>
+              <w:t xml:space="preserve">Every input the work depends on is verified fresh; a freshness card (Section 5, H1)</w:t>
             </w:r>
           </w:p>
         </w:tc>
@@ -2996,7 +3920,7 @@
         <w:pStyle w:val="ListParagraph"/>
         <w:numPr>
           <w:ilvl w:val="0"/>
-          <w:numId w:val="2"/>
+          <w:numId w:val="3"/>
         </w:numPr>
         <w:spacing w:after="70" w:line="264"/>
       </w:pPr>
@@ -3026,7 +3950,7 @@
         <w:pStyle w:val="ListParagraph"/>
         <w:numPr>
           <w:ilvl w:val="0"/>
-          <w:numId w:val="2"/>
+          <w:numId w:val="3"/>
         </w:numPr>
         <w:spacing w:after="70" w:line="264"/>
       </w:pPr>
@@ -3056,7 +3980,7 @@
         <w:pStyle w:val="ListParagraph"/>
         <w:numPr>
           <w:ilvl w:val="0"/>
-          <w:numId w:val="2"/>
+          <w:numId w:val="3"/>
         </w:numPr>
         <w:spacing w:after="70" w:line="264"/>
       </w:pPr>
@@ -3086,7 +4010,7 @@
         <w:pStyle w:val="ListParagraph"/>
         <w:numPr>
           <w:ilvl w:val="0"/>
-          <w:numId w:val="2"/>
+          <w:numId w:val="3"/>
         </w:numPr>
         <w:spacing w:after="70" w:line="264"/>
       </w:pPr>
@@ -3116,7 +4040,7 @@
         <w:pStyle w:val="ListParagraph"/>
         <w:numPr>
           <w:ilvl w:val="0"/>
-          <w:numId w:val="2"/>
+          <w:numId w:val="3"/>
         </w:numPr>
         <w:spacing w:after="70" w:line="264"/>
       </w:pPr>
@@ -3146,7 +4070,7 @@
         <w:pStyle w:val="ListParagraph"/>
         <w:numPr>
           <w:ilvl w:val="0"/>
-          <w:numId w:val="2"/>
+          <w:numId w:val="3"/>
         </w:numPr>
         <w:spacing w:after="70" w:line="264"/>
       </w:pPr>
@@ -3635,7 +4559,7 @@
           <w:sz w:val="30"/>
           <w:szCs w:val="30"/>
         </w:rPr>
-        <w:t xml:space="preserve">4. Handshakes</w:t>
+        <w:t xml:space="preserve">5. Handshakes</w:t>
       </w:r>
     </w:p>
     <w:p>
@@ -4851,7 +5775,7 @@
           <w:sz w:val="30"/>
           <w:szCs w:val="30"/>
         </w:rPr>
-        <w:t xml:space="preserve">5. Controls: Machine Checks Over Checklists</w:t>
+        <w:t xml:space="preserve">6. Controls: Machine Checks Over Checklists</w:t>
       </w:r>
     </w:p>
     <w:p>
@@ -5888,7 +6812,7 @@
           <w:sz w:val="30"/>
           <w:szCs w:val="30"/>
         </w:rPr>
-        <w:t xml:space="preserve">6. Change Control for the Rules Themselves</w:t>
+        <w:t xml:space="preserve">7. Change Control for the Rules Themselves</w:t>
       </w:r>
     </w:p>
     <w:p>
@@ -5910,7 +6834,7 @@
         <w:pStyle w:val="ListParagraph"/>
         <w:numPr>
           <w:ilvl w:val="0"/>
-          <w:numId w:val="3"/>
+          <w:numId w:val="4"/>
         </w:numPr>
         <w:spacing w:after="70" w:line="264"/>
       </w:pPr>
@@ -5940,7 +6864,7 @@
         <w:pStyle w:val="ListParagraph"/>
         <w:numPr>
           <w:ilvl w:val="0"/>
-          <w:numId w:val="3"/>
+          <w:numId w:val="4"/>
         </w:numPr>
         <w:spacing w:after="70" w:line="264"/>
       </w:pPr>
@@ -5970,7 +6894,7 @@
         <w:pStyle w:val="ListParagraph"/>
         <w:numPr>
           <w:ilvl w:val="0"/>
-          <w:numId w:val="3"/>
+          <w:numId w:val="4"/>
         </w:numPr>
         <w:spacing w:after="70" w:line="264"/>
       </w:pPr>
@@ -6000,7 +6924,7 @@
         <w:pStyle w:val="ListParagraph"/>
         <w:numPr>
           <w:ilvl w:val="0"/>
-          <w:numId w:val="3"/>
+          <w:numId w:val="4"/>
         </w:numPr>
         <w:spacing w:after="70" w:line="264"/>
       </w:pPr>
@@ -6030,7 +6954,7 @@
         <w:pStyle w:val="ListParagraph"/>
         <w:numPr>
           <w:ilvl w:val="0"/>
-          <w:numId w:val="3"/>
+          <w:numId w:val="4"/>
         </w:numPr>
         <w:spacing w:after="70" w:line="264"/>
       </w:pPr>
@@ -6060,7 +6984,7 @@
         <w:pStyle w:val="ListParagraph"/>
         <w:numPr>
           <w:ilvl w:val="0"/>
-          <w:numId w:val="3"/>
+          <w:numId w:val="4"/>
         </w:numPr>
         <w:spacing w:after="70" w:line="264"/>
       </w:pPr>
@@ -6090,7 +7014,7 @@
         <w:pStyle w:val="ListParagraph"/>
         <w:numPr>
           <w:ilvl w:val="0"/>
-          <w:numId w:val="3"/>
+          <w:numId w:val="4"/>
         </w:numPr>
         <w:spacing w:after="70" w:line="264"/>
       </w:pPr>
@@ -6133,7 +7057,7 @@
           <w:sz w:val="30"/>
           <w:szCs w:val="30"/>
         </w:rPr>
-        <w:t xml:space="preserve">7. Evidence and Honest Status</w:t>
+        <w:t xml:space="preserve">8. Evidence and Honest Status</w:t>
       </w:r>
     </w:p>
     <w:p>
@@ -7527,7 +8451,7 @@
         <w:pStyle w:val="ListParagraph"/>
         <w:numPr>
           <w:ilvl w:val="0"/>
-          <w:numId w:val="3"/>
+          <w:numId w:val="4"/>
         </w:numPr>
         <w:spacing w:after="70" w:line="264"/>
       </w:pPr>
@@ -7557,7 +8481,7 @@
         <w:pStyle w:val="ListParagraph"/>
         <w:numPr>
           <w:ilvl w:val="0"/>
-          <w:numId w:val="3"/>
+          <w:numId w:val="4"/>
         </w:numPr>
         <w:spacing w:after="70" w:line="264"/>
       </w:pPr>
@@ -7587,7 +8511,7 @@
         <w:pStyle w:val="ListParagraph"/>
         <w:numPr>
           <w:ilvl w:val="0"/>
-          <w:numId w:val="3"/>
+          <w:numId w:val="4"/>
         </w:numPr>
         <w:spacing w:after="70" w:line="264"/>
       </w:pPr>
@@ -7617,7 +8541,7 @@
         <w:pStyle w:val="ListParagraph"/>
         <w:numPr>
           <w:ilvl w:val="0"/>
-          <w:numId w:val="3"/>
+          <w:numId w:val="4"/>
         </w:numPr>
         <w:spacing w:after="70" w:line="264"/>
       </w:pPr>
@@ -7816,6 +8740,150 @@
                 <w:sz w:val="17"/>
                 <w:szCs w:val="17"/>
               </w:rPr>
+              <w:t xml:space="preserve">Four-part brief</w:t>
+            </w:r>
+          </w:p>
+        </w:tc>
+        <w:tc>
+          <w:tcPr>
+            <w:tcW w:type="dxa" w:w="7748"/>
+            <w:tcBorders>
+              <w:top w:val="single" w:color="D9D9D9" w:sz="4"/>
+              <w:left w:val="single" w:color="D9D9D9" w:sz="4"/>
+              <w:bottom w:val="single" w:color="D9D9D9" w:sz="4"/>
+              <w:right w:val="single" w:color="D9D9D9" w:sz="4"/>
+            </w:tcBorders>
+            <w:tcMar>
+              <w:top w:type="dxa" w:w="70"/>
+              <w:left w:type="dxa" w:w="100"/>
+              <w:bottom w:type="dxa" w:w="50"/>
+              <w:right w:type="dxa" w:w="100"/>
+            </w:tcMar>
+          </w:tcPr>
+          <w:p>
+            <w:pPr>
+              <w:spacing w:after="40" w:line="252"/>
+            </w:pPr>
+            <w:r>
+              <w:rPr>
+                <w:rFonts w:ascii="Poppins" w:cs="Poppins" w:eastAsia="Poppins" w:hAnsi="Poppins"/>
+                <w:b w:val="false"/>
+                <w:bCs w:val="false"/>
+                <w:color w:val="1A1A1A"/>
+                <w:sz w:val="17"/>
+                <w:szCs w:val="17"/>
+              </w:rPr>
+              <w:t xml:space="preserve">Persona: a proposal compliance reviewer. Task: build the compliance matrix for this solicitation. Context: the solicitation and every amendment, plus the capture plan. Format: one row per requirement with its paragraph reference, response location, and status.</w:t>
+            </w:r>
+          </w:p>
+        </w:tc>
+      </w:tr>
+      <w:tr>
+        <w:trPr>
+          <w:cantSplit/>
+        </w:trPr>
+        <w:tc>
+          <w:tcPr>
+            <w:tcW w:type="dxa" w:w="1900"/>
+            <w:tcBorders>
+              <w:top w:val="single" w:color="D9D9D9" w:sz="4"/>
+              <w:left w:val="single" w:color="D9D9D9" w:sz="4"/>
+              <w:bottom w:val="single" w:color="D9D9D9" w:sz="4"/>
+              <w:right w:val="single" w:color="D9D9D9" w:sz="4"/>
+            </w:tcBorders>
+            <w:shd w:fill="F6F8FA" w:color="auto" w:val="clear"/>
+            <w:tcMar>
+              <w:top w:type="dxa" w:w="70"/>
+              <w:left w:type="dxa" w:w="100"/>
+              <w:bottom w:type="dxa" w:w="50"/>
+              <w:right w:type="dxa" w:w="100"/>
+            </w:tcMar>
+          </w:tcPr>
+          <w:p>
+            <w:pPr>
+              <w:spacing w:after="40" w:line="252"/>
+            </w:pPr>
+            <w:r>
+              <w:rPr>
+                <w:rFonts w:ascii="Poppins" w:cs="Poppins" w:eastAsia="Poppins" w:hAnsi="Poppins"/>
+                <w:b/>
+                <w:bCs/>
+                <w:color w:val="1A1A1A"/>
+                <w:sz w:val="17"/>
+                <w:szCs w:val="17"/>
+              </w:rPr>
+              <w:t xml:space="preserve">Knowledge base</w:t>
+            </w:r>
+          </w:p>
+        </w:tc>
+        <w:tc>
+          <w:tcPr>
+            <w:tcW w:type="dxa" w:w="7748"/>
+            <w:tcBorders>
+              <w:top w:val="single" w:color="D9D9D9" w:sz="4"/>
+              <w:left w:val="single" w:color="D9D9D9" w:sz="4"/>
+              <w:bottom w:val="single" w:color="D9D9D9" w:sz="4"/>
+              <w:right w:val="single" w:color="D9D9D9" w:sz="4"/>
+            </w:tcBorders>
+            <w:shd w:fill="F6F8FA" w:color="auto" w:val="clear"/>
+            <w:tcMar>
+              <w:top w:type="dxa" w:w="70"/>
+              <w:left w:type="dxa" w:w="100"/>
+              <w:bottom w:type="dxa" w:w="50"/>
+              <w:right w:type="dxa" w:w="100"/>
+            </w:tcMar>
+          </w:tcPr>
+          <w:p>
+            <w:pPr>
+              <w:spacing w:after="40" w:line="252"/>
+            </w:pPr>
+            <w:r>
+              <w:rPr>
+                <w:rFonts w:ascii="Poppins" w:cs="Poppins" w:eastAsia="Poppins" w:hAnsi="Poppins"/>
+                <w:b w:val="false"/>
+                <w:bCs w:val="false"/>
+                <w:color w:val="1A1A1A"/>
+                <w:sz w:val="17"/>
+                <w:szCs w:val="17"/>
+              </w:rPr>
+              <w:t xml:space="preserve">“What are all the documents we have on past performance with this customer?” returns each document with its date and location, and names every repository searched and any it could not reach.</w:t>
+            </w:r>
+          </w:p>
+        </w:tc>
+      </w:tr>
+      <w:tr>
+        <w:trPr>
+          <w:cantSplit/>
+        </w:trPr>
+        <w:tc>
+          <w:tcPr>
+            <w:tcW w:type="dxa" w:w="1900"/>
+            <w:tcBorders>
+              <w:top w:val="single" w:color="D9D9D9" w:sz="4"/>
+              <w:left w:val="single" w:color="D9D9D9" w:sz="4"/>
+              <w:bottom w:val="single" w:color="D9D9D9" w:sz="4"/>
+              <w:right w:val="single" w:color="D9D9D9" w:sz="4"/>
+            </w:tcBorders>
+            <w:tcMar>
+              <w:top w:type="dxa" w:w="70"/>
+              <w:left w:type="dxa" w:w="100"/>
+              <w:bottom w:type="dxa" w:w="50"/>
+              <w:right w:type="dxa" w:w="100"/>
+            </w:tcMar>
+          </w:tcPr>
+          <w:p>
+            <w:pPr>
+              <w:spacing w:after="40" w:line="252"/>
+            </w:pPr>
+            <w:r>
+              <w:rPr>
+                <w:rFonts w:ascii="Poppins" w:cs="Poppins" w:eastAsia="Poppins" w:hAnsi="Poppins"/>
+                <w:b/>
+                <w:bCs/>
+                <w:color w:val="1A1A1A"/>
+                <w:sz w:val="17"/>
+                <w:szCs w:val="17"/>
+              </w:rPr>
               <w:t xml:space="preserve">L1, L3</w:t>
             </w:r>
           </w:p>
@@ -8383,6 +9451,7 @@
     </w:p>
     <w:p>
       <w:pPr>
+        <w:keepNext/>
         <w:spacing w:after="120" w:before="0" w:line="276"/>
       </w:pPr>
       <w:r>
@@ -8553,7 +9622,7 @@
                 <w:sz w:val="17"/>
                 <w:szCs w:val="17"/>
               </w:rPr>
-              <w:t xml:space="preserve">L1, L3</w:t>
+              <w:t xml:space="preserve">Section 2</w:t>
             </w:r>
           </w:p>
         </w:tc>
@@ -8586,7 +9655,7 @@
                 <w:sz w:val="17"/>
                 <w:szCs w:val="17"/>
               </w:rPr>
-              <w:t xml:space="preserve">Data policy written after 39 of 220 records were found filled from model memory; two-source rule for any fact that moves a valuation</w:t>
+              <w:t xml:space="preserve">The owner's workflow notes (the four-part brief and the knowledge-base question), matched to practice: the research system's master brief and inputs file, and its pull-first rule for stored project files</w:t>
             </w:r>
           </w:p>
         </w:tc>
@@ -8619,7 +9688,7 @@
                 <w:sz w:val="17"/>
                 <w:szCs w:val="17"/>
               </w:rPr>
-              <w:t xml:space="preserve">2026-07-13</w:t>
+              <w:t xml:space="preserve">2026-07 (practice), 2026-10-09 (notes)</w:t>
             </w:r>
           </w:p>
         </w:tc>
@@ -8658,7 +9727,7 @@
                 <w:sz w:val="17"/>
                 <w:szCs w:val="17"/>
               </w:rPr>
-              <w:t xml:space="preserve">L2, L6</w:t>
+              <w:t xml:space="preserve">L1, L3</w:t>
             </w:r>
           </w:p>
         </w:tc>
@@ -8692,7 +9761,7 @@
                 <w:sz w:val="17"/>
                 <w:szCs w:val="17"/>
               </w:rPr>
-              <w:t xml:space="preserve">Operating principles written because a prior tool invented statistics, version numbers, and "monitoring agents"</w:t>
+              <w:t xml:space="preserve">Data policy written after 39 of 220 records were found filled from model memory; two-source rule for any fact that moves a valuation</w:t>
             </w:r>
           </w:p>
         </w:tc>
@@ -8764,7 +9833,7 @@
                 <w:sz w:val="17"/>
                 <w:szCs w:val="17"/>
               </w:rPr>
-              <w:t xml:space="preserve">L4, L5</w:t>
+              <w:t xml:space="preserve">L2, L6</w:t>
             </w:r>
           </w:p>
         </w:tc>
@@ -8797,7 +9866,7 @@
                 <w:sz w:val="17"/>
                 <w:szCs w:val="17"/>
               </w:rPr>
-              <w:t xml:space="preserve">INC-9: "couldn't verify" written about eight items never attempted; a tally built partly from recall inverted its own conclusion</w:t>
+              <w:t xml:space="preserve">Operating principles written because a prior tool invented statistics, version numbers, and "monitoring agents"</w:t>
             </w:r>
           </w:p>
         </w:tc>
@@ -8830,7 +9899,7 @@
                 <w:sz w:val="17"/>
                 <w:szCs w:val="17"/>
               </w:rPr>
-              <w:t xml:space="preserve">2026-08-11</w:t>
+              <w:t xml:space="preserve">2026-07-13</w:t>
             </w:r>
           </w:p>
         </w:tc>
@@ -8869,7 +9938,7 @@
                 <w:sz w:val="17"/>
                 <w:szCs w:val="17"/>
               </w:rPr>
-              <w:t xml:space="preserve">L6</w:t>
+              <w:t xml:space="preserve">L4, L5</w:t>
             </w:r>
           </w:p>
         </w:tc>
@@ -8903,7 +9972,7 @@
                 <w:sz w:val="17"/>
                 <w:szCs w:val="17"/>
               </w:rPr>
-              <w:t xml:space="preserve">Confidence percentages retired after measurement showed no calibration</w:t>
+              <w:t xml:space="preserve">INC-9: "couldn't verify" written about eight items never attempted; a tally built partly from recall inverted its own conclusion</w:t>
             </w:r>
           </w:p>
         </w:tc>
@@ -8937,7 +10006,7 @@
                 <w:sz w:val="17"/>
                 <w:szCs w:val="17"/>
               </w:rPr>
-              <w:t xml:space="preserve">2026-08-09</w:t>
+              <w:t xml:space="preserve">2026-08-11</w:t>
             </w:r>
           </w:p>
         </w:tc>
@@ -8975,7 +10044,7 @@
                 <w:sz w:val="17"/>
                 <w:szCs w:val="17"/>
               </w:rPr>
-              <w:t xml:space="preserve">L7</w:t>
+              <w:t xml:space="preserve">L6</w:t>
             </w:r>
           </w:p>
         </w:tc>
@@ -9008,7 +10077,7 @@
                 <w:sz w:val="17"/>
                 <w:szCs w:val="17"/>
               </w:rPr>
-              <w:t xml:space="preserve">No-silent-defaults law, adopted from a cross-model comparison</w:t>
+              <w:t xml:space="preserve">Confidence percentages retired after measurement showed no calibration</w:t>
             </w:r>
           </w:p>
         </w:tc>
@@ -9041,7 +10110,7 @@
                 <w:sz w:val="17"/>
                 <w:szCs w:val="17"/>
               </w:rPr>
-              <w:t xml:space="preserve">2026-07-15</w:t>
+              <w:t xml:space="preserve">2026-08-09</w:t>
             </w:r>
           </w:p>
         </w:tc>
@@ -9080,7 +10149,7 @@
                 <w:sz w:val="17"/>
                 <w:szCs w:val="17"/>
               </w:rPr>
-              <w:t xml:space="preserve">L8</w:t>
+              <w:t xml:space="preserve">L7</w:t>
             </w:r>
           </w:p>
         </w:tc>
@@ -9114,7 +10183,7 @@
                 <w:sz w:val="17"/>
                 <w:szCs w:val="17"/>
               </w:rPr>
-              <w:t xml:space="preserve">Scope fence; flag-don't-fix</w:t>
+              <w:t xml:space="preserve">No-silent-defaults law, adopted from a cross-model comparison</w:t>
             </w:r>
           </w:p>
         </w:tc>
@@ -9148,7 +10217,7 @@
                 <w:sz w:val="17"/>
                 <w:szCs w:val="17"/>
               </w:rPr>
-              <w:t xml:space="preserve">2026-07-11</w:t>
+              <w:t xml:space="preserve">2026-07-15</w:t>
             </w:r>
           </w:p>
         </w:tc>
@@ -9186,7 +10255,7 @@
                 <w:sz w:val="17"/>
                 <w:szCs w:val="17"/>
               </w:rPr>
-              <w:t xml:space="preserve">L9</w:t>
+              <w:t xml:space="preserve">L8</w:t>
             </w:r>
           </w:p>
         </w:tc>
@@ -9219,7 +10288,7 @@
                 <w:sz w:val="17"/>
                 <w:szCs w:val="17"/>
               </w:rPr>
-              <w:t xml:space="preserve">Operating principle written because a prior tool over-validated every decision; "commit to one recommendation" rule</w:t>
+              <w:t xml:space="preserve">Scope fence; flag-don't-fix</w:t>
             </w:r>
           </w:p>
         </w:tc>
@@ -9252,7 +10321,7 @@
                 <w:sz w:val="17"/>
                 <w:szCs w:val="17"/>
               </w:rPr>
-              <w:t xml:space="preserve">2026-07-11, 2026-07-13</w:t>
+              <w:t xml:space="preserve">2026-07-11</w:t>
             </w:r>
           </w:p>
         </w:tc>
@@ -9291,7 +10360,7 @@
                 <w:sz w:val="17"/>
                 <w:szCs w:val="17"/>
               </w:rPr>
-              <w:t xml:space="preserve">L10</w:t>
+              <w:t xml:space="preserve">L9</w:t>
             </w:r>
           </w:p>
         </w:tc>
@@ -9325,7 +10394,7 @@
                 <w:sz w:val="17"/>
                 <w:szCs w:val="17"/>
               </w:rPr>
-              <w:t xml:space="preserve">Anti-ceremony law; pinned by a test case that must answer a one-line question directly</w:t>
+              <w:t xml:space="preserve">Operating principle written because a prior tool over-validated every decision; "commit to one recommendation" rule</w:t>
             </w:r>
           </w:p>
         </w:tc>
@@ -9359,7 +10428,7 @@
                 <w:sz w:val="17"/>
                 <w:szCs w:val="17"/>
               </w:rPr>
-              <w:t xml:space="preserve">2026-07-11</w:t>
+              <w:t xml:space="preserve">2026-07-11, 2026-07-13</w:t>
             </w:r>
           </w:p>
         </w:tc>
@@ -9397,7 +10466,7 @@
                 <w:sz w:val="17"/>
                 <w:szCs w:val="17"/>
               </w:rPr>
-              <w:t xml:space="preserve">Step 1</w:t>
+              <w:t xml:space="preserve">L10</w:t>
             </w:r>
           </w:p>
         </w:tc>
@@ -9430,7 +10499,7 @@
                 <w:sz w:val="17"/>
                 <w:szCs w:val="17"/>
               </w:rPr>
-              <w:t xml:space="preserve">Plan shown before the work, after a plan was produced but delivered only inside the final report (INC-2026-08-19-01)</w:t>
+              <w:t xml:space="preserve">Anti-ceremony law; pinned by a test case that must answer a one-line question directly</w:t>
             </w:r>
           </w:p>
         </w:tc>
@@ -9463,7 +10532,7 @@
                 <w:sz w:val="17"/>
                 <w:szCs w:val="17"/>
               </w:rPr>
-              <w:t xml:space="preserve">2026-08-20</w:t>
+              <w:t xml:space="preserve">2026-07-11</w:t>
             </w:r>
           </w:p>
         </w:tc>
@@ -9502,7 +10571,7 @@
                 <w:sz w:val="17"/>
                 <w:szCs w:val="17"/>
               </w:rPr>
-              <w:t xml:space="preserve">Step 2, H1</w:t>
+              <w:t xml:space="preserve">Step 1</w:t>
             </w:r>
           </w:p>
         </w:tc>
@@ -9536,7 +10605,7 @@
                 <w:sz w:val="17"/>
                 <w:szCs w:val="17"/>
               </w:rPr>
-              <w:t xml:space="preserve">Daily freshness protocol: a verification card before any analysis, never emitted without the checks behind it</w:t>
+              <w:t xml:space="preserve">Plan shown before the work, after a plan was produced but delivered only inside the final report (INC-2026-08-19-01)</w:t>
             </w:r>
           </w:p>
         </w:tc>
@@ -9570,7 +10639,7 @@
                 <w:sz w:val="17"/>
                 <w:szCs w:val="17"/>
               </w:rPr>
-              <w:t xml:space="preserve">2026-07-13</w:t>
+              <w:t xml:space="preserve">2026-08-20</w:t>
             </w:r>
           </w:p>
         </w:tc>
@@ -9608,7 +10677,7 @@
                 <w:sz w:val="17"/>
                 <w:szCs w:val="17"/>
               </w:rPr>
-              <w:t xml:space="preserve">Step 4</w:t>
+              <w:t xml:space="preserve">Step 2, H1</w:t>
             </w:r>
           </w:p>
         </w:tc>
@@ -9641,7 +10710,7 @@
                 <w:sz w:val="17"/>
                 <w:szCs w:val="17"/>
               </w:rPr>
-              <w:t xml:space="preserve">Six-step adversarial pass; gap audit added after INC-9</w:t>
+              <w:t xml:space="preserve">Daily freshness protocol: a verification card before any analysis, never emitted without the checks behind it</w:t>
             </w:r>
           </w:p>
         </w:tc>
@@ -9674,7 +10743,7 @@
                 <w:sz w:val="17"/>
                 <w:szCs w:val="17"/>
               </w:rPr>
-              <w:t xml:space="preserve">2026-07-11, 2026-08-11</w:t>
+              <w:t xml:space="preserve">2026-07-13</w:t>
             </w:r>
           </w:p>
         </w:tc>
@@ -9713,7 +10782,7 @@
                 <w:sz w:val="17"/>
                 <w:szCs w:val="17"/>
               </w:rPr>
-              <w:t xml:space="preserve">Step 5</w:t>
+              <w:t xml:space="preserve">Step 4</w:t>
             </w:r>
           </w:p>
         </w:tc>
@@ -9747,7 +10816,7 @@
                 <w:sz w:val="17"/>
                 <w:szCs w:val="17"/>
               </w:rPr>
-              <w:t xml:space="preserve">Report format standard: method first, evidence versus inference marked, decisions left to the owner</w:t>
+              <w:t xml:space="preserve">Six-step adversarial pass; gap audit added after INC-9</w:t>
             </w:r>
           </w:p>
         </w:tc>
@@ -9781,7 +10850,7 @@
                 <w:sz w:val="17"/>
                 <w:szCs w:val="17"/>
               </w:rPr>
-              <w:t xml:space="preserve">2026-08-03</w:t>
+              <w:t xml:space="preserve">2026-07-11, 2026-08-11</w:t>
             </w:r>
           </w:p>
         </w:tc>
@@ -9819,7 +10888,7 @@
                 <w:sz w:val="17"/>
                 <w:szCs w:val="17"/>
               </w:rPr>
-              <w:t xml:space="preserve">Step 6, H10</w:t>
+              <w:t xml:space="preserve">Step 5</w:t>
             </w:r>
           </w:p>
         </w:tc>
@@ -9852,7 +10921,7 @@
                 <w:sz w:val="17"/>
                 <w:szCs w:val="17"/>
               </w:rPr>
-              <w:t xml:space="preserve">A data pull that was never saved; a published view left stale while every repository believed itself current</w:t>
+              <w:t xml:space="preserve">Report format standard: method first, evidence versus inference marked, decisions left to the owner</w:t>
             </w:r>
           </w:p>
         </w:tc>
@@ -9885,7 +10954,7 @@
                 <w:sz w:val="17"/>
                 <w:szCs w:val="17"/>
               </w:rPr>
-              <w:t xml:space="preserve">2026-07-24, 2026-07-27</w:t>
+              <w:t xml:space="preserve">2026-08-03</w:t>
             </w:r>
           </w:p>
         </w:tc>
@@ -9924,7 +10993,7 @@
                 <w:sz w:val="17"/>
                 <w:szCs w:val="17"/>
               </w:rPr>
-              <w:t xml:space="preserve">Step 7</w:t>
+              <w:t xml:space="preserve">Step 6, H10</w:t>
             </w:r>
           </w:p>
         </w:tc>
@@ -9958,7 +11027,7 @@
                 <w:sz w:val="17"/>
                 <w:szCs w:val="17"/>
               </w:rPr>
-              <w:t xml:space="preserve">Named sequence adopted, ending with the list of gates that actually ran, after a validated rule was lost from the instruction block (INC-11)</w:t>
+              <w:t xml:space="preserve">A data pull that was never saved; a published view left stale while every repository believed itself current</w:t>
             </w:r>
           </w:p>
         </w:tc>
@@ -9992,7 +11061,7 @@
                 <w:sz w:val="17"/>
                 <w:szCs w:val="17"/>
               </w:rPr>
-              <w:t xml:space="preserve">2026-08-12</w:t>
+              <w:t xml:space="preserve">2026-07-24, 2026-07-27</w:t>
             </w:r>
           </w:p>
         </w:tc>
@@ -10030,7 +11099,7 @@
                 <w:sz w:val="17"/>
                 <w:szCs w:val="17"/>
               </w:rPr>
-              <w:t xml:space="preserve">H2</w:t>
+              <w:t xml:space="preserve">Step 7</w:t>
             </w:r>
           </w:p>
         </w:tc>
@@ -10063,7 +11132,7 @@
                 <w:sz w:val="17"/>
                 <w:szCs w:val="17"/>
               </w:rPr>
-              <w:t xml:space="preserve">A 158-step practice session in which the operation's total length was discovered only at the end</w:t>
+              <w:t xml:space="preserve">Named sequence adopted, ending with the list of gates that actually ran, after a validated rule was lost from the instruction block (INC-11)</w:t>
             </w:r>
           </w:p>
         </w:tc>
@@ -10096,7 +11165,7 @@
                 <w:sz w:val="17"/>
                 <w:szCs w:val="17"/>
               </w:rPr>
-              <w:t xml:space="preserve">2026-07-12</w:t>
+              <w:t xml:space="preserve">2026-08-12</w:t>
             </w:r>
           </w:p>
         </w:tc>
@@ -10135,7 +11204,7 @@
                 <w:sz w:val="17"/>
                 <w:szCs w:val="17"/>
               </w:rPr>
-              <w:t xml:space="preserve">H3, H6</w:t>
+              <w:t xml:space="preserve">H2</w:t>
             </w:r>
           </w:p>
         </w:tc>
@@ -10169,7 +11238,7 @@
                 <w:sz w:val="17"/>
                 <w:szCs w:val="17"/>
               </w:rPr>
-              <w:t xml:space="preserve">A 127-step live simulation in which a lost tool result led to double-logged entries and common names were mismatched</w:t>
+              <w:t xml:space="preserve">A 158-step practice session in which the operation's total length was discovered only at the end</w:t>
             </w:r>
           </w:p>
         </w:tc>
@@ -10241,7 +11310,7 @@
                 <w:sz w:val="17"/>
                 <w:szCs w:val="17"/>
               </w:rPr>
-              <w:t xml:space="preserve">H5</w:t>
+              <w:t xml:space="preserve">H3, H6</w:t>
             </w:r>
           </w:p>
         </w:tc>
@@ -10274,7 +11343,7 @@
                 <w:sz w:val="17"/>
                 <w:szCs w:val="17"/>
               </w:rPr>
-              <w:t xml:space="preserve">Corrections rule learned in live use: a repeated input is skipped, never treated as a correction</w:t>
+              <w:t xml:space="preserve">A 127-step live simulation in which a lost tool result led to double-logged entries and common names were mismatched</w:t>
             </w:r>
           </w:p>
         </w:tc>
@@ -10307,7 +11376,7 @@
                 <w:sz w:val="17"/>
                 <w:szCs w:val="17"/>
               </w:rPr>
-              <w:t xml:space="preserve">2026-07-11</w:t>
+              <w:t xml:space="preserve">2026-07-12</w:t>
             </w:r>
           </w:p>
         </w:tc>
@@ -10346,7 +11415,7 @@
                 <w:sz w:val="17"/>
                 <w:szCs w:val="17"/>
               </w:rPr>
-              <w:t xml:space="preserve">H4</w:t>
+              <w:t xml:space="preserve">H5</w:t>
             </w:r>
           </w:p>
         </w:tc>
@@ -10380,7 +11449,7 @@
                 <w:sz w:val="17"/>
                 <w:szCs w:val="17"/>
               </w:rPr>
-              <w:t xml:space="preserve">Two surfaces ranked by different objectives disagreed on the top answer in 19 of 26 turns</w:t>
+              <w:t xml:space="preserve">Corrections rule learned in live use: a repeated input is skipped, never treated as a correction</w:t>
             </w:r>
           </w:p>
         </w:tc>
@@ -10414,7 +11483,7 @@
                 <w:sz w:val="17"/>
                 <w:szCs w:val="17"/>
               </w:rPr>
-              <w:t xml:space="preserve">2026-08-09</w:t>
+              <w:t xml:space="preserve">2026-07-11</w:t>
             </w:r>
           </w:p>
         </w:tc>
@@ -10452,7 +11521,7 @@
                 <w:sz w:val="17"/>
                 <w:szCs w:val="17"/>
               </w:rPr>
-              <w:t xml:space="preserve">H7</w:t>
+              <w:t xml:space="preserve">H4</w:t>
             </w:r>
           </w:p>
         </w:tc>
@@ -10485,7 +11554,7 @@
                 <w:sz w:val="17"/>
                 <w:szCs w:val="17"/>
               </w:rPr>
-              <w:t xml:space="preserve">Recovery commands made single-step, with the prior state preserved for rollback</w:t>
+              <w:t xml:space="preserve">Two surfaces ranked by different objectives disagreed on the top answer in 19 of 26 turns</w:t>
             </w:r>
           </w:p>
         </w:tc>
@@ -10557,7 +11626,7 @@
                 <w:sz w:val="17"/>
                 <w:szCs w:val="17"/>
               </w:rPr>
-              <w:t xml:space="preserve">H8</w:t>
+              <w:t xml:space="preserve">H7</w:t>
             </w:r>
           </w:p>
         </w:tc>
@@ -10591,7 +11660,7 @@
                 <w:sz w:val="17"/>
                 <w:szCs w:val="17"/>
               </w:rPr>
-              <w:t xml:space="preserve">Speed rule for a 45-second decision clock: one command per turn, no side research</w:t>
+              <w:t xml:space="preserve">Recovery commands made single-step, with the prior state preserved for rollback</w:t>
             </w:r>
           </w:p>
         </w:tc>
@@ -10625,7 +11694,7 @@
                 <w:sz w:val="17"/>
                 <w:szCs w:val="17"/>
               </w:rPr>
-              <w:t xml:space="preserve">by 2026-07-12</w:t>
+              <w:t xml:space="preserve">2026-08-09</w:t>
             </w:r>
           </w:p>
         </w:tc>
@@ -10663,7 +11732,7 @@
                 <w:sz w:val="17"/>
                 <w:szCs w:val="17"/>
               </w:rPr>
-              <w:t xml:space="preserve">H9</w:t>
+              <w:t xml:space="preserve">H8</w:t>
             </w:r>
           </w:p>
         </w:tc>
@@ -10696,7 +11765,7 @@
                 <w:sz w:val="17"/>
                 <w:szCs w:val="17"/>
               </w:rPr>
-              <w:t xml:space="preserve">The same missed item recurred because a hand-run checklist was skippable</w:t>
+              <w:t xml:space="preserve">Speed rule for a 45-second decision clock: one command per turn, no side research</w:t>
             </w:r>
           </w:p>
         </w:tc>
@@ -10729,7 +11798,7 @@
                 <w:sz w:val="17"/>
                 <w:szCs w:val="17"/>
               </w:rPr>
-              <w:t xml:space="preserve">2026-09-08</w:t>
+              <w:t xml:space="preserve">by 2026-07-12</w:t>
             </w:r>
           </w:p>
         </w:tc>
@@ -10768,7 +11837,7 @@
                 <w:sz w:val="17"/>
                 <w:szCs w:val="17"/>
               </w:rPr>
-              <w:t xml:space="preserve">Controls</w:t>
+              <w:t xml:space="preserve">H9</w:t>
             </w:r>
           </w:p>
         </w:tc>
@@ -10802,7 +11871,7 @@
                 <w:sz w:val="17"/>
                 <w:szCs w:val="17"/>
               </w:rPr>
-              <w:t xml:space="preserve">See the Origin column in Section 5</w:t>
+              <w:t xml:space="preserve">The same missed item recurred because a hand-run checklist was skippable</w:t>
             </w:r>
           </w:p>
         </w:tc>
@@ -10836,7 +11905,7 @@
                 <w:sz w:val="17"/>
                 <w:szCs w:val="17"/>
               </w:rPr>
-              <w:t xml:space="preserve">2026-07-13 to 2026-10-08</w:t>
+              <w:t xml:space="preserve">2026-09-08</w:t>
             </w:r>
           </w:p>
         </w:tc>
@@ -10874,6 +11943,111 @@
                 <w:sz w:val="17"/>
                 <w:szCs w:val="17"/>
               </w:rPr>
+              <w:t xml:space="preserve">Controls</w:t>
+            </w:r>
+          </w:p>
+        </w:tc>
+        <w:tc>
+          <w:tcPr>
+            <w:tcW w:type="dxa" w:w="5848"/>
+            <w:tcBorders>
+              <w:top w:val="single" w:color="D9D9D9" w:sz="4"/>
+              <w:left w:val="single" w:color="D9D9D9" w:sz="4"/>
+              <w:bottom w:val="single" w:color="D9D9D9" w:sz="4"/>
+              <w:right w:val="single" w:color="D9D9D9" w:sz="4"/>
+            </w:tcBorders>
+            <w:tcMar>
+              <w:top w:type="dxa" w:w="70"/>
+              <w:left w:type="dxa" w:w="100"/>
+              <w:bottom w:type="dxa" w:w="50"/>
+              <w:right w:type="dxa" w:w="100"/>
+            </w:tcMar>
+          </w:tcPr>
+          <w:p>
+            <w:pPr>
+              <w:spacing w:after="40" w:line="252"/>
+            </w:pPr>
+            <w:r>
+              <w:rPr>
+                <w:rFonts w:ascii="Poppins" w:cs="Poppins" w:eastAsia="Poppins" w:hAnsi="Poppins"/>
+                <w:b w:val="false"/>
+                <w:bCs w:val="false"/>
+                <w:color w:val="1A1A1A"/>
+                <w:sz w:val="17"/>
+                <w:szCs w:val="17"/>
+              </w:rPr>
+              <w:t xml:space="preserve">See the Origin column in Section 6</w:t>
+            </w:r>
+          </w:p>
+        </w:tc>
+        <w:tc>
+          <w:tcPr>
+            <w:tcW w:type="dxa" w:w="1900"/>
+            <w:tcBorders>
+              <w:top w:val="single" w:color="D9D9D9" w:sz="4"/>
+              <w:left w:val="single" w:color="D9D9D9" w:sz="4"/>
+              <w:bottom w:val="single" w:color="D9D9D9" w:sz="4"/>
+              <w:right w:val="single" w:color="D9D9D9" w:sz="4"/>
+            </w:tcBorders>
+            <w:tcMar>
+              <w:top w:type="dxa" w:w="70"/>
+              <w:left w:type="dxa" w:w="100"/>
+              <w:bottom w:type="dxa" w:w="50"/>
+              <w:right w:type="dxa" w:w="100"/>
+            </w:tcMar>
+          </w:tcPr>
+          <w:p>
+            <w:pPr>
+              <w:spacing w:after="40" w:line="252"/>
+            </w:pPr>
+            <w:r>
+              <w:rPr>
+                <w:rFonts w:ascii="Poppins" w:cs="Poppins" w:eastAsia="Poppins" w:hAnsi="Poppins"/>
+                <w:b w:val="false"/>
+                <w:bCs w:val="false"/>
+                <w:color w:val="1A1A1A"/>
+                <w:sz w:val="17"/>
+                <w:szCs w:val="17"/>
+              </w:rPr>
+              <w:t xml:space="preserve">2026-07-13 to 2026-10-08</w:t>
+            </w:r>
+          </w:p>
+        </w:tc>
+      </w:tr>
+      <w:tr>
+        <w:trPr>
+          <w:cantSplit/>
+        </w:trPr>
+        <w:tc>
+          <w:tcPr>
+            <w:tcW w:type="dxa" w:w="1900"/>
+            <w:tcBorders>
+              <w:top w:val="single" w:color="D9D9D9" w:sz="4"/>
+              <w:left w:val="single" w:color="D9D9D9" w:sz="4"/>
+              <w:bottom w:val="single" w:color="D9D9D9" w:sz="4"/>
+              <w:right w:val="single" w:color="D9D9D9" w:sz="4"/>
+            </w:tcBorders>
+            <w:shd w:fill="F6F8FA" w:color="auto" w:val="clear"/>
+            <w:tcMar>
+              <w:top w:type="dxa" w:w="70"/>
+              <w:left w:type="dxa" w:w="100"/>
+              <w:bottom w:type="dxa" w:w="50"/>
+              <w:right w:type="dxa" w:w="100"/>
+            </w:tcMar>
+          </w:tcPr>
+          <w:p>
+            <w:pPr>
+              <w:spacing w:after="40" w:line="252"/>
+            </w:pPr>
+            <w:r>
+              <w:rPr>
+                <w:rFonts w:ascii="Poppins" w:cs="Poppins" w:eastAsia="Poppins" w:hAnsi="Poppins"/>
+                <w:b/>
+                <w:bCs/>
+                <w:color w:val="1A1A1A"/>
+                <w:sz w:val="17"/>
+                <w:szCs w:val="17"/>
+              </w:rPr>
               <w:t xml:space="preserve">Change control</w:t>
             </w:r>
           </w:p>
@@ -10887,6 +12061,7 @@
               <w:bottom w:val="single" w:color="D9D9D9" w:sz="4"/>
               <w:right w:val="single" w:color="D9D9D9" w:sz="4"/>
             </w:tcBorders>
+            <w:shd w:fill="F6F8FA" w:color="auto" w:val="clear"/>
             <w:tcMar>
               <w:top w:type="dxa" w:w="70"/>
               <w:left w:type="dxa" w:w="100"/>
@@ -10920,6 +12095,7 @@
               <w:bottom w:val="single" w:color="D9D9D9" w:sz="4"/>
               <w:right w:val="single" w:color="D9D9D9" w:sz="4"/>
             </w:tcBorders>
+            <w:shd w:fill="F6F8FA" w:color="auto" w:val="clear"/>
             <w:tcMar>
               <w:top w:type="dxa" w:w="70"/>
               <w:left w:type="dxa" w:w="100"/>
@@ -11186,6 +12362,23 @@
       </w:rPr>
     </w:lvl>
   </w:abstractNum>
+  <w:abstractNum w:abstractNumId="4" w15:restartNumberingAfterBreak="0">
+    <w:multiLevelType w:val="hybridMultilevel"/>
+    <w:lvl w:ilvl="0" w15:tentative="1">
+      <w:start w:val="1"/>
+      <w:numFmt w:val="decimal"/>
+      <w:lvlText w:val="%1."/>
+      <w:lvlJc w:val="left"/>
+      <w:pPr>
+        <w:ind w:left="400" w:hanging="300"/>
+      </w:pPr>
+      <w:rPr>
+        <w:b/>
+        <w:bCs/>
+        <w:color w:val="0F436E"/>
+      </w:rPr>
+    </w:lvl>
+  </w:abstractNum>
   <w:num w:numId="1">
     <w:abstractNumId w:val="1"/>
     <w:lvlOverride w:ilvl="0">
@@ -11199,6 +12392,12 @@
     </w:lvlOverride>
   </w:num>
   <w:num w:numId="3">
+    <w:abstractNumId w:val="4"/>
+    <w:lvlOverride w:ilvl="0">
+      <w:startOverride w:val="1"/>
+    </w:lvlOverride>
+  </w:num>
+  <w:num w:numId="4">
     <w:abstractNumId w:val="2"/>
     <w:lvlOverride w:ilvl="0">
       <w:startOverride w:val="1"/>

</xml_diff>

<commit_message>
Add data insights and Agent Building: Skills to Section 2
Folds in David's third set of notes. "Generate insights on data across
multiple documents" and "Data cleaning and charts" extend the knowledge-base
subsection, grounded in the deck repo's two-source verified statistics record.
A new subsection, Agent Building: Skills, turns his notes into a four-step
improvement loop (draft, investigate, find what works, curate) and three
authoring rules (lead with description, keep main file lean, explain why),
each tied to this library's own authoring standard with counts measured today.

Flagged to the owner: "Have agent write final tool call" is read as curation
being the session's last action, and the charts principle has no repo basis.
Every section reference verified against the source headings; two builds
identical; guard passes.

Co-Authored-By: Claude Opus 5.5 <noreply@anthropic.com>
Claude-Session: https://claude.ai/code/session_01AYc6fhZNmvyoAQ67RgbJuK
</commit_message>
<xml_diff>
--- a/results/2026-10-09/ai-rules-of-engagement/Rules-of-Engagement-Operational-AI_2026-10-09.docx
+++ b/results/2026-10-09/ai-rules-of-engagement/Rules-of-Engagement-Operational-AI_2026-10-09.docx
@@ -314,7 +314,7 @@
           <w:sz w:val="20"/>
           <w:szCs w:val="20"/>
         </w:rPr>
-        <w:t xml:space="preserve">A force multiplier needs aim. Two practices turn an AI assistant from a chat window into a working teammate: a structured brief for every task, and a knowledge base the AI searches before it answers.</w:t>
+        <w:t xml:space="preserve">A force multiplier needs aim. Three practices turn an AI assistant from a chat window into a working teammate: a structured brief for every task, a knowledge base the AI searches before it answers, and skills that carry the team's know-how from one task to the next.</w:t>
       </w:r>
     </w:p>
     <w:p>
@@ -1208,6 +1208,641 @@
     </w:p>
     <w:p>
       <w:pPr>
+        <w:keepNext/>
+        <w:spacing w:after="120" w:before="60" w:line="276"/>
+      </w:pPr>
+      <w:r>
+        <w:rPr>
+          <w:rFonts w:ascii="Poppins" w:cs="Poppins" w:eastAsia="Poppins" w:hAnsi="Poppins"/>
+          <w:b/>
+          <w:bCs/>
+          <w:color w:val="1A1A1A"/>
+          <w:sz w:val="20"/>
+          <w:szCs w:val="20"/>
+        </w:rPr>
+        <w:t xml:space="preserve">Beyond finding documents.</w:t>
+      </w:r>
+      <w:r>
+        <w:rPr>
+          <w:rFonts w:ascii="Poppins" w:cs="Poppins" w:eastAsia="Poppins" w:hAnsi="Poppins"/>
+          <w:color w:val="1A1A1A"/>
+          <w:sz w:val="20"/>
+          <w:szCs w:val="20"/>
+        </w:rPr>
+        <w:t xml:space="preserve"> Once the records are in reach, two further uses follow, each under the same laws.</w:t>
+      </w:r>
+    </w:p>
+    <w:p>
+      <w:pPr>
+        <w:pStyle w:val="ListParagraph"/>
+        <w:numPr>
+          <w:ilvl w:val="0"/>
+          <w:numId w:val="3"/>
+        </w:numPr>
+        <w:spacing w:after="70" w:line="264"/>
+      </w:pPr>
+      <w:r>
+        <w:rPr>
+          <w:rFonts w:ascii="Poppins" w:cs="Poppins" w:eastAsia="Poppins" w:hAnsi="Poppins"/>
+          <w:b/>
+          <w:bCs/>
+          <w:color w:val="1A1A1A"/>
+          <w:sz w:val="20"/>
+          <w:szCs w:val="20"/>
+        </w:rPr>
+        <w:t xml:space="preserve">Generate insights on data across multiple documents.</w:t>
+      </w:r>
+      <w:r>
+        <w:rPr>
+          <w:rFonts w:ascii="Poppins" w:cs="Poppins" w:eastAsia="Poppins" w:hAnsi="Poppins"/>
+          <w:color w:val="1A1A1A"/>
+          <w:sz w:val="20"/>
+          <w:szCs w:val="20"/>
+        </w:rPr>
+        <w:t xml:space="preserve"> Every insight names the documents and figures it rests on, so a reader can trace it back. A pattern noticed across documents is labeled as an inference until the numbers behind it are computed (Laws L2 and L5).</w:t>
+      </w:r>
+    </w:p>
+    <w:p>
+      <w:pPr>
+        <w:pStyle w:val="ListParagraph"/>
+        <w:numPr>
+          <w:ilvl w:val="0"/>
+          <w:numId w:val="3"/>
+        </w:numPr>
+        <w:spacing w:after="70" w:line="264"/>
+      </w:pPr>
+      <w:r>
+        <w:rPr>
+          <w:rFonts w:ascii="Poppins" w:cs="Poppins" w:eastAsia="Poppins" w:hAnsi="Poppins"/>
+          <w:b/>
+          <w:bCs/>
+          <w:color w:val="1A1A1A"/>
+          <w:sz w:val="20"/>
+          <w:szCs w:val="20"/>
+        </w:rPr>
+        <w:t xml:space="preserve">Data cleaning and charts.</w:t>
+      </w:r>
+      <w:r>
+        <w:rPr>
+          <w:rFonts w:ascii="Poppins" w:cs="Poppins" w:eastAsia="Poppins" w:hAnsi="Poppins"/>
+          <w:color w:val="1A1A1A"/>
+          <w:sz w:val="20"/>
+          <w:szCs w:val="20"/>
+        </w:rPr>
+        <w:t xml:space="preserve"> Cleaning is a logged, repeatable step: every record dropped, merged, or corrected is listed with its reason, and the raw source is kept beside the cleaned version. Charts are drawn from the cleaned, computed data, never from figures copied out of a summary.</w:t>
+      </w:r>
+    </w:p>
+    <w:p>
+      <w:pPr>
+        <w:spacing w:after="120" w:before="120" w:line="276"/>
+      </w:pPr>
+      <w:r>
+        <w:rPr>
+          <w:rFonts w:ascii="Poppins" w:cs="Poppins" w:eastAsia="Poppins" w:hAnsi="Poppins"/>
+          <w:b/>
+          <w:bCs/>
+          <w:color w:val="1A1A1A"/>
+          <w:sz w:val="20"/>
+          <w:szCs w:val="20"/>
+        </w:rPr>
+        <w:t xml:space="preserve">In practice.</w:t>
+      </w:r>
+      <w:r>
+        <w:rPr>
+          <w:rFonts w:ascii="Poppins" w:cs="Poppins" w:eastAsia="Poppins" w:hAnsi="Poppins"/>
+          <w:color w:val="1A1A1A"/>
+          <w:sz w:val="20"/>
+          <w:szCs w:val="20"/>
+        </w:rPr>
+        <w:t xml:space="preserve"> The decision tool's historical statistics come from two independent public sources and are kept only where both agree within rounding. The few conflicts are listed beside the clean record instead of being resolved silently, the raw source pages are pinned by a cryptographic hash, and two runs of the cleaning produce byte-identical output.</w:t>
+      </w:r>
+    </w:p>
+    <w:p>
+      <w:pPr>
+        <w:pStyle w:val="Heading2"/>
+        <w:keepNext/>
+        <w:spacing w:after="80" w:before="200"/>
+      </w:pPr>
+      <w:r>
+        <w:rPr>
+          <w:rFonts w:ascii="Eurostile" w:cs="Eurostile" w:eastAsia="Eurostile" w:hAnsi="Eurostile"/>
+          <w:b/>
+          <w:bCs/>
+          <w:color w:val="0F436E"/>
+          <w:sz w:val="23"/>
+          <w:szCs w:val="23"/>
+        </w:rPr>
+        <w:t xml:space="preserve">Agent Building: Skills</w:t>
+      </w:r>
+    </w:p>
+    <w:p>
+      <w:pPr>
+        <w:spacing w:after="120" w:before="0" w:line="276"/>
+      </w:pPr>
+      <w:r>
+        <w:rPr>
+          <w:rFonts w:ascii="Poppins" w:cs="Poppins" w:eastAsia="Poppins" w:hAnsi="Poppins"/>
+          <w:color w:val="1A1A1A"/>
+          <w:sz w:val="20"/>
+          <w:szCs w:val="20"/>
+        </w:rPr>
+        <w:t xml:space="preserve">A skill is a reusable instruction file that gives an agent the context for one kind of work: how something works, what good looks like, and what has gone wrong before. Skills are how a team's know-how outlasts a single chat session.</w:t>
+      </w:r>
+    </w:p>
+    <w:p>
+      <w:pPr>
+        <w:keepNext/>
+        <w:spacing w:after="120" w:before="0" w:line="276"/>
+      </w:pPr>
+      <w:r>
+        <w:rPr>
+          <w:rFonts w:ascii="Poppins" w:cs="Poppins" w:eastAsia="Poppins" w:hAnsi="Poppins"/>
+          <w:b/>
+          <w:bCs/>
+          <w:color w:val="1A1A1A"/>
+          <w:sz w:val="20"/>
+          <w:szCs w:val="20"/>
+        </w:rPr>
+        <w:t xml:space="preserve">Providing context into “how does something work.”</w:t>
+      </w:r>
+      <w:r>
+        <w:rPr>
+          <w:rFonts w:ascii="Poppins" w:cs="Poppins" w:eastAsia="Poppins" w:hAnsi="Poppins"/>
+          <w:color w:val="1A1A1A"/>
+          <w:sz w:val="20"/>
+          <w:szCs w:val="20"/>
+        </w:rPr>
+        <w:t xml:space="preserve"> A skill explains the mechanism of the work, not only the steps, so the agent can handle cases its author never foresaw. Skills improve through a four-step loop:</w:t>
+      </w:r>
+    </w:p>
+    <w:p>
+      <w:pPr>
+        <w:pStyle w:val="ListParagraph"/>
+        <w:numPr>
+          <w:ilvl w:val="0"/>
+          <w:numId w:val="4"/>
+        </w:numPr>
+        <w:spacing w:after="70" w:line="264"/>
+      </w:pPr>
+      <w:r>
+        <w:rPr>
+          <w:rFonts w:ascii="Poppins" w:cs="Poppins" w:eastAsia="Poppins" w:hAnsi="Poppins"/>
+          <w:b/>
+          <w:bCs/>
+          <w:color w:val="1A1A1A"/>
+          <w:sz w:val="20"/>
+          <w:szCs w:val="20"/>
+        </w:rPr>
+        <w:t xml:space="preserve">Building off initial draft to always look to improve context.</w:t>
+      </w:r>
+      <w:r>
+        <w:rPr>
+          <w:rFonts w:ascii="Poppins" w:cs="Poppins" w:eastAsia="Poppins" w:hAnsi="Poppins"/>
+          <w:color w:val="1A1A1A"/>
+          <w:sz w:val="20"/>
+          <w:szCs w:val="20"/>
+        </w:rPr>
+        <w:t xml:space="preserve"> A skill starts as a draft and is improved with every use. A draft in use beats a perfect skill never shipped.</w:t>
+      </w:r>
+    </w:p>
+    <w:p>
+      <w:pPr>
+        <w:pStyle w:val="ListParagraph"/>
+        <w:numPr>
+          <w:ilvl w:val="0"/>
+          <w:numId w:val="4"/>
+        </w:numPr>
+        <w:spacing w:after="70" w:line="264"/>
+      </w:pPr>
+      <w:r>
+        <w:rPr>
+          <w:rFonts w:ascii="Poppins" w:cs="Poppins" w:eastAsia="Poppins" w:hAnsi="Poppins"/>
+          <w:b/>
+          <w:bCs/>
+          <w:color w:val="1A1A1A"/>
+          <w:sz w:val="20"/>
+          <w:szCs w:val="20"/>
+        </w:rPr>
+        <w:t xml:space="preserve">Investigate: have agent use draft to fill gaps.</w:t>
+      </w:r>
+      <w:r>
+        <w:rPr>
+          <w:rFonts w:ascii="Poppins" w:cs="Poppins" w:eastAsia="Poppins" w:hAnsi="Poppins"/>
+          <w:color w:val="1A1A1A"/>
+          <w:sz w:val="20"/>
+          <w:szCs w:val="20"/>
+        </w:rPr>
+        <w:t xml:space="preserve"> The agent runs the draft on real work and reports where the draft was silent or wrong. Those gaps become the next revision.</w:t>
+      </w:r>
+    </w:p>
+    <w:p>
+      <w:pPr>
+        <w:pStyle w:val="ListParagraph"/>
+        <w:numPr>
+          <w:ilvl w:val="0"/>
+          <w:numId w:val="4"/>
+        </w:numPr>
+        <w:spacing w:after="70" w:line="264"/>
+      </w:pPr>
+      <w:r>
+        <w:rPr>
+          <w:rFonts w:ascii="Poppins" w:cs="Poppins" w:eastAsia="Poppins" w:hAnsi="Poppins"/>
+          <w:b/>
+          <w:bCs/>
+          <w:color w:val="1A1A1A"/>
+          <w:sz w:val="20"/>
+          <w:szCs w:val="20"/>
+        </w:rPr>
+        <w:t xml:space="preserve">Find what works / doesn't work, and continuously update.</w:t>
+      </w:r>
+      <w:r>
+        <w:rPr>
+          <w:rFonts w:ascii="Poppins" w:cs="Poppins" w:eastAsia="Poppins" w:hAnsi="Poppins"/>
+          <w:color w:val="1A1A1A"/>
+          <w:sz w:val="20"/>
+          <w:szCs w:val="20"/>
+        </w:rPr>
+        <w:t xml:space="preserve"> Each change is tested, not assumed: the prediction is written down first, the before and after are compared, and any regression blocks the change (Section 7). Dead ends are recorded so they are not retried.</w:t>
+      </w:r>
+    </w:p>
+    <w:p>
+      <w:pPr>
+        <w:pStyle w:val="ListParagraph"/>
+        <w:numPr>
+          <w:ilvl w:val="0"/>
+          <w:numId w:val="4"/>
+        </w:numPr>
+        <w:spacing w:after="70" w:line="264"/>
+      </w:pPr>
+      <w:r>
+        <w:rPr>
+          <w:rFonts w:ascii="Poppins" w:cs="Poppins" w:eastAsia="Poppins" w:hAnsi="Poppins"/>
+          <w:b/>
+          <w:bCs/>
+          <w:color w:val="1A1A1A"/>
+          <w:sz w:val="20"/>
+          <w:szCs w:val="20"/>
+        </w:rPr>
+        <w:t xml:space="preserve">(CURATE) Have agent write “what did you learn, what can you make easier for next agent.” Have agent write final tool call.</w:t>
+      </w:r>
+      <w:r>
+        <w:rPr>
+          <w:rFonts w:ascii="Poppins" w:cs="Poppins" w:eastAsia="Poppins" w:hAnsi="Poppins"/>
+          <w:color w:val="1A1A1A"/>
+          <w:sz w:val="20"/>
+          <w:szCs w:val="20"/>
+        </w:rPr>
+        <w:t xml:space="preserve"> Curation is the last action of every session: the agent writes down what it learned and what would make the next agent faster. Making it the final step means it cannot be skipped when time runs short.</w:t>
+      </w:r>
+    </w:p>
+    <w:p>
+      <w:pPr>
+        <w:keepNext/>
+        <w:spacing w:after="120" w:before="120" w:line="276"/>
+      </w:pPr>
+      <w:r>
+        <w:rPr>
+          <w:rFonts w:ascii="Poppins" w:cs="Poppins" w:eastAsia="Poppins" w:hAnsi="Poppins"/>
+          <w:color w:val="1A1A1A"/>
+          <w:sz w:val="20"/>
+          <w:szCs w:val="20"/>
+        </w:rPr>
+        <w:t xml:space="preserve">Three authoring rules keep skills effective:</w:t>
+      </w:r>
+    </w:p>
+    <w:tbl>
+      <w:tblPr>
+        <w:tblW w:type="dxa" w:w="9648"/>
+        <w:tblBorders>
+          <w:top w:val="single" w:color="auto" w:sz="4"/>
+          <w:left w:val="single" w:color="auto" w:sz="4"/>
+          <w:bottom w:val="single" w:color="auto" w:sz="4"/>
+          <w:right w:val="single" w:color="auto" w:sz="4"/>
+          <w:insideH w:val="single" w:color="auto" w:sz="4"/>
+          <w:insideV w:val="single" w:color="auto" w:sz="4"/>
+        </w:tblBorders>
+        <w:tblLayout w:type="fixed"/>
+      </w:tblPr>
+      <w:tblGrid>
+        <w:gridCol w:w="2600"/>
+        <w:gridCol w:w="7048"/>
+      </w:tblGrid>
+      <w:tr>
+        <w:trPr>
+          <w:tblHeader/>
+        </w:trPr>
+        <w:tc>
+          <w:tcPr>
+            <w:tcW w:type="dxa" w:w="2600"/>
+            <w:tcBorders>
+              <w:top w:val="single" w:color="D9D9D9" w:sz="4"/>
+              <w:left w:val="single" w:color="D9D9D9" w:sz="4"/>
+              <w:bottom w:val="single" w:color="D9D9D9" w:sz="4"/>
+              <w:right w:val="single" w:color="D9D9D9" w:sz="4"/>
+            </w:tcBorders>
+            <w:shd w:fill="0F436E" w:color="auto" w:val="clear"/>
+            <w:tcMar>
+              <w:top w:type="dxa" w:w="70"/>
+              <w:left w:type="dxa" w:w="100"/>
+              <w:bottom w:type="dxa" w:w="50"/>
+              <w:right w:type="dxa" w:w="100"/>
+            </w:tcMar>
+          </w:tcPr>
+          <w:p>
+            <w:pPr>
+              <w:spacing w:after="40" w:line="252"/>
+            </w:pPr>
+            <w:r>
+              <w:rPr>
+                <w:rFonts w:ascii="Eurostile" w:cs="Eurostile" w:eastAsia="Eurostile" w:hAnsi="Eurostile"/>
+                <w:b/>
+                <w:bCs/>
+                <w:color w:val="FFFFFF"/>
+                <w:sz w:val="17"/>
+                <w:szCs w:val="17"/>
+              </w:rPr>
+              <w:t xml:space="preserve">Rule</w:t>
+            </w:r>
+          </w:p>
+        </w:tc>
+        <w:tc>
+          <w:tcPr>
+            <w:tcW w:type="dxa" w:w="7048"/>
+            <w:tcBorders>
+              <w:top w:val="single" w:color="D9D9D9" w:sz="4"/>
+              <w:left w:val="single" w:color="D9D9D9" w:sz="4"/>
+              <w:bottom w:val="single" w:color="D9D9D9" w:sz="4"/>
+              <w:right w:val="single" w:color="D9D9D9" w:sz="4"/>
+            </w:tcBorders>
+            <w:shd w:fill="0F436E" w:color="auto" w:val="clear"/>
+            <w:tcMar>
+              <w:top w:type="dxa" w:w="70"/>
+              <w:left w:type="dxa" w:w="100"/>
+              <w:bottom w:type="dxa" w:w="50"/>
+              <w:right w:type="dxa" w:w="100"/>
+            </w:tcMar>
+          </w:tcPr>
+          <w:p>
+            <w:pPr>
+              <w:spacing w:after="40" w:line="252"/>
+            </w:pPr>
+            <w:r>
+              <w:rPr>
+                <w:rFonts w:ascii="Eurostile" w:cs="Eurostile" w:eastAsia="Eurostile" w:hAnsi="Eurostile"/>
+                <w:b/>
+                <w:bCs/>
+                <w:color w:val="FFFFFF"/>
+                <w:sz w:val="17"/>
+                <w:szCs w:val="17"/>
+              </w:rPr>
+              <w:t xml:space="preserve">Why it works</w:t>
+            </w:r>
+          </w:p>
+        </w:tc>
+      </w:tr>
+      <w:tr>
+        <w:trPr>
+          <w:cantSplit/>
+        </w:trPr>
+        <w:tc>
+          <w:tcPr>
+            <w:tcW w:type="dxa" w:w="2600"/>
+            <w:tcBorders>
+              <w:top w:val="single" w:color="D9D9D9" w:sz="4"/>
+              <w:left w:val="single" w:color="D9D9D9" w:sz="4"/>
+              <w:bottom w:val="single" w:color="D9D9D9" w:sz="4"/>
+              <w:right w:val="single" w:color="D9D9D9" w:sz="4"/>
+            </w:tcBorders>
+            <w:tcMar>
+              <w:top w:type="dxa" w:w="70"/>
+              <w:left w:type="dxa" w:w="100"/>
+              <w:bottom w:type="dxa" w:w="50"/>
+              <w:right w:type="dxa" w:w="100"/>
+            </w:tcMar>
+          </w:tcPr>
+          <w:p>
+            <w:pPr>
+              <w:spacing w:after="40" w:line="252"/>
+            </w:pPr>
+            <w:r>
+              <w:rPr>
+                <w:rFonts w:ascii="Poppins" w:cs="Poppins" w:eastAsia="Poppins" w:hAnsi="Poppins"/>
+                <w:b/>
+                <w:bCs/>
+                <w:color w:val="1A1A1A"/>
+                <w:sz w:val="17"/>
+                <w:szCs w:val="17"/>
+              </w:rPr>
+              <w:t xml:space="preserve">Lead with description</w:t>
+            </w:r>
+          </w:p>
+        </w:tc>
+        <w:tc>
+          <w:tcPr>
+            <w:tcW w:type="dxa" w:w="7048"/>
+            <w:tcBorders>
+              <w:top w:val="single" w:color="D9D9D9" w:sz="4"/>
+              <w:left w:val="single" w:color="D9D9D9" w:sz="4"/>
+              <w:bottom w:val="single" w:color="D9D9D9" w:sz="4"/>
+              <w:right w:val="single" w:color="D9D9D9" w:sz="4"/>
+            </w:tcBorders>
+            <w:tcMar>
+              <w:top w:type="dxa" w:w="70"/>
+              <w:left w:type="dxa" w:w="100"/>
+              <w:bottom w:type="dxa" w:w="50"/>
+              <w:right w:type="dxa" w:w="100"/>
+            </w:tcMar>
+          </w:tcPr>
+          <w:p>
+            <w:pPr>
+              <w:spacing w:after="40" w:line="252"/>
+            </w:pPr>
+            <w:r>
+              <w:rPr>
+                <w:rFonts w:ascii="Poppins" w:cs="Poppins" w:eastAsia="Poppins" w:hAnsi="Poppins"/>
+                <w:b w:val="false"/>
+                <w:bCs w:val="false"/>
+                <w:color w:val="1A1A1A"/>
+                <w:sz w:val="17"/>
+                <w:szCs w:val="17"/>
+              </w:rPr>
+              <w:t xml:space="preserve">The description is the only part an agent sees before deciding whether to use the skill. It carries the whole trigger: when to use it, the phrasings that should call it, and when not to use it.</w:t>
+            </w:r>
+          </w:p>
+        </w:tc>
+      </w:tr>
+      <w:tr>
+        <w:trPr>
+          <w:cantSplit/>
+        </w:trPr>
+        <w:tc>
+          <w:tcPr>
+            <w:tcW w:type="dxa" w:w="2600"/>
+            <w:tcBorders>
+              <w:top w:val="single" w:color="D9D9D9" w:sz="4"/>
+              <w:left w:val="single" w:color="D9D9D9" w:sz="4"/>
+              <w:bottom w:val="single" w:color="D9D9D9" w:sz="4"/>
+              <w:right w:val="single" w:color="D9D9D9" w:sz="4"/>
+            </w:tcBorders>
+            <w:shd w:fill="F6F8FA" w:color="auto" w:val="clear"/>
+            <w:tcMar>
+              <w:top w:type="dxa" w:w="70"/>
+              <w:left w:type="dxa" w:w="100"/>
+              <w:bottom w:type="dxa" w:w="50"/>
+              <w:right w:type="dxa" w:w="100"/>
+            </w:tcMar>
+          </w:tcPr>
+          <w:p>
+            <w:pPr>
+              <w:spacing w:after="40" w:line="252"/>
+            </w:pPr>
+            <w:r>
+              <w:rPr>
+                <w:rFonts w:ascii="Poppins" w:cs="Poppins" w:eastAsia="Poppins" w:hAnsi="Poppins"/>
+                <w:b/>
+                <w:bCs/>
+                <w:color w:val="1A1A1A"/>
+                <w:sz w:val="17"/>
+                <w:szCs w:val="17"/>
+              </w:rPr>
+              <w:t xml:space="preserve">Keep main file lean</w:t>
+            </w:r>
+          </w:p>
+        </w:tc>
+        <w:tc>
+          <w:tcPr>
+            <w:tcW w:type="dxa" w:w="7048"/>
+            <w:tcBorders>
+              <w:top w:val="single" w:color="D9D9D9" w:sz="4"/>
+              <w:left w:val="single" w:color="D9D9D9" w:sz="4"/>
+              <w:bottom w:val="single" w:color="D9D9D9" w:sz="4"/>
+              <w:right w:val="single" w:color="D9D9D9" w:sz="4"/>
+            </w:tcBorders>
+            <w:shd w:fill="F6F8FA" w:color="auto" w:val="clear"/>
+            <w:tcMar>
+              <w:top w:type="dxa" w:w="70"/>
+              <w:left w:type="dxa" w:w="100"/>
+              <w:bottom w:type="dxa" w:w="50"/>
+              <w:right w:type="dxa" w:w="100"/>
+            </w:tcMar>
+          </w:tcPr>
+          <w:p>
+            <w:pPr>
+              <w:spacing w:after="40" w:line="252"/>
+            </w:pPr>
+            <w:r>
+              <w:rPr>
+                <w:rFonts w:ascii="Poppins" w:cs="Poppins" w:eastAsia="Poppins" w:hAnsi="Poppins"/>
+                <w:b w:val="false"/>
+                <w:bCs w:val="false"/>
+                <w:color w:val="1A1A1A"/>
+                <w:sz w:val="17"/>
+                <w:szCs w:val="17"/>
+              </w:rPr>
+              <w:t xml:space="preserve">Descriptions are always loaded and the main file loads every time the skill is used, so every line costs attention on every run. Detail, references, and scripts live in supporting files that load only when needed.</w:t>
+            </w:r>
+          </w:p>
+        </w:tc>
+      </w:tr>
+      <w:tr>
+        <w:trPr>
+          <w:cantSplit/>
+        </w:trPr>
+        <w:tc>
+          <w:tcPr>
+            <w:tcW w:type="dxa" w:w="2600"/>
+            <w:tcBorders>
+              <w:top w:val="single" w:color="D9D9D9" w:sz="4"/>
+              <w:left w:val="single" w:color="D9D9D9" w:sz="4"/>
+              <w:bottom w:val="single" w:color="D9D9D9" w:sz="4"/>
+              <w:right w:val="single" w:color="D9D9D9" w:sz="4"/>
+            </w:tcBorders>
+            <w:tcMar>
+              <w:top w:type="dxa" w:w="70"/>
+              <w:left w:type="dxa" w:w="100"/>
+              <w:bottom w:type="dxa" w:w="50"/>
+              <w:right w:type="dxa" w:w="100"/>
+            </w:tcMar>
+          </w:tcPr>
+          <w:p>
+            <w:pPr>
+              <w:spacing w:after="40" w:line="252"/>
+            </w:pPr>
+            <w:r>
+              <w:rPr>
+                <w:rFonts w:ascii="Poppins" w:cs="Poppins" w:eastAsia="Poppins" w:hAnsi="Poppins"/>
+                <w:b/>
+                <w:bCs/>
+                <w:color w:val="1A1A1A"/>
+                <w:sz w:val="17"/>
+                <w:szCs w:val="17"/>
+              </w:rPr>
+              <w:t xml:space="preserve">Explain why, don't command</w:t>
+            </w:r>
+          </w:p>
+        </w:tc>
+        <w:tc>
+          <w:tcPr>
+            <w:tcW w:type="dxa" w:w="7048"/>
+            <w:tcBorders>
+              <w:top w:val="single" w:color="D9D9D9" w:sz="4"/>
+              <w:left w:val="single" w:color="D9D9D9" w:sz="4"/>
+              <w:bottom w:val="single" w:color="D9D9D9" w:sz="4"/>
+              <w:right w:val="single" w:color="D9D9D9" w:sz="4"/>
+            </w:tcBorders>
+            <w:tcMar>
+              <w:top w:type="dxa" w:w="70"/>
+              <w:left w:type="dxa" w:w="100"/>
+              <w:bottom w:type="dxa" w:w="50"/>
+              <w:right w:type="dxa" w:w="100"/>
+            </w:tcMar>
+          </w:tcPr>
+          <w:p>
+            <w:pPr>
+              <w:spacing w:after="40" w:line="252"/>
+            </w:pPr>
+            <w:r>
+              <w:rPr>
+                <w:rFonts w:ascii="Poppins" w:cs="Poppins" w:eastAsia="Poppins" w:hAnsi="Poppins"/>
+                <w:b w:val="false"/>
+                <w:bCs w:val="false"/>
+                <w:color w:val="1A1A1A"/>
+                <w:sz w:val="17"/>
+                <w:szCs w:val="17"/>
+              </w:rPr>
+              <w:t xml:space="preserve">A bare “must” teaches compliance; a reasoned rule teaches judgment. An agent that understands why a rule exists applies it to cases the author never listed.</w:t>
+            </w:r>
+          </w:p>
+        </w:tc>
+      </w:tr>
+    </w:tbl>
+    <w:p>
+      <w:pPr>
+        <w:spacing w:after="120" w:before="120" w:line="276"/>
+      </w:pPr>
+      <w:r>
+        <w:rPr>
+          <w:rFonts w:ascii="Poppins" w:cs="Poppins" w:eastAsia="Poppins" w:hAnsi="Poppins"/>
+          <w:b/>
+          <w:bCs/>
+          <w:color w:val="1A1A1A"/>
+          <w:sz w:val="20"/>
+          <w:szCs w:val="20"/>
+        </w:rPr>
+        <w:t xml:space="preserve">In practice.</w:t>
+      </w:r>
+      <w:r>
+        <w:rPr>
+          <w:rFonts w:ascii="Poppins" w:cs="Poppins" w:eastAsia="Poppins" w:hAnsi="Poppins"/>
+          <w:color w:val="1A1A1A"/>
+          <w:sz w:val="20"/>
+          <w:szCs w:val="20"/>
+        </w:rPr>
+        <w:t xml:space="preserve"> The governance library behind this standard is built this way. All 21 of its modules lead with a description that states when to use the module and when not to, and the repository's guard checks every description on every change. Rules in the governance modules carry their reasons. Improvements are recorded as dated amendments that name the incident behind them, and a 30-entry ledger records failures, dead ends, and wins as symptom, root cause, evidence, and status. Trigger accuracy is measured, not assumed (Section 8).</w:t>
+      </w:r>
+    </w:p>
+    <w:p>
+      <w:pPr>
         <w:pStyle w:val="Heading1"/>
         <w:keepNext/>
         <w:pBdr>
@@ -3920,7 +4555,7 @@
         <w:pStyle w:val="ListParagraph"/>
         <w:numPr>
           <w:ilvl w:val="0"/>
-          <w:numId w:val="3"/>
+          <w:numId w:val="5"/>
         </w:numPr>
         <w:spacing w:after="70" w:line="264"/>
       </w:pPr>
@@ -3950,7 +4585,7 @@
         <w:pStyle w:val="ListParagraph"/>
         <w:numPr>
           <w:ilvl w:val="0"/>
-          <w:numId w:val="3"/>
+          <w:numId w:val="5"/>
         </w:numPr>
         <w:spacing w:after="70" w:line="264"/>
       </w:pPr>
@@ -3980,7 +4615,7 @@
         <w:pStyle w:val="ListParagraph"/>
         <w:numPr>
           <w:ilvl w:val="0"/>
-          <w:numId w:val="3"/>
+          <w:numId w:val="5"/>
         </w:numPr>
         <w:spacing w:after="70" w:line="264"/>
       </w:pPr>
@@ -4010,7 +4645,7 @@
         <w:pStyle w:val="ListParagraph"/>
         <w:numPr>
           <w:ilvl w:val="0"/>
-          <w:numId w:val="3"/>
+          <w:numId w:val="5"/>
         </w:numPr>
         <w:spacing w:after="70" w:line="264"/>
       </w:pPr>
@@ -4040,7 +4675,7 @@
         <w:pStyle w:val="ListParagraph"/>
         <w:numPr>
           <w:ilvl w:val="0"/>
-          <w:numId w:val="3"/>
+          <w:numId w:val="5"/>
         </w:numPr>
         <w:spacing w:after="70" w:line="264"/>
       </w:pPr>
@@ -4070,7 +4705,7 @@
         <w:pStyle w:val="ListParagraph"/>
         <w:numPr>
           <w:ilvl w:val="0"/>
-          <w:numId w:val="3"/>
+          <w:numId w:val="5"/>
         </w:numPr>
         <w:spacing w:after="70" w:line="264"/>
       </w:pPr>
@@ -6834,7 +7469,7 @@
         <w:pStyle w:val="ListParagraph"/>
         <w:numPr>
           <w:ilvl w:val="0"/>
-          <w:numId w:val="4"/>
+          <w:numId w:val="3"/>
         </w:numPr>
         <w:spacing w:after="70" w:line="264"/>
       </w:pPr>
@@ -6864,7 +7499,7 @@
         <w:pStyle w:val="ListParagraph"/>
         <w:numPr>
           <w:ilvl w:val="0"/>
-          <w:numId w:val="4"/>
+          <w:numId w:val="3"/>
         </w:numPr>
         <w:spacing w:after="70" w:line="264"/>
       </w:pPr>
@@ -6894,7 +7529,7 @@
         <w:pStyle w:val="ListParagraph"/>
         <w:numPr>
           <w:ilvl w:val="0"/>
-          <w:numId w:val="4"/>
+          <w:numId w:val="3"/>
         </w:numPr>
         <w:spacing w:after="70" w:line="264"/>
       </w:pPr>
@@ -6924,7 +7559,7 @@
         <w:pStyle w:val="ListParagraph"/>
         <w:numPr>
           <w:ilvl w:val="0"/>
-          <w:numId w:val="4"/>
+          <w:numId w:val="3"/>
         </w:numPr>
         <w:spacing w:after="70" w:line="264"/>
       </w:pPr>
@@ -6954,7 +7589,7 @@
         <w:pStyle w:val="ListParagraph"/>
         <w:numPr>
           <w:ilvl w:val="0"/>
-          <w:numId w:val="4"/>
+          <w:numId w:val="3"/>
         </w:numPr>
         <w:spacing w:after="70" w:line="264"/>
       </w:pPr>
@@ -6984,7 +7619,7 @@
         <w:pStyle w:val="ListParagraph"/>
         <w:numPr>
           <w:ilvl w:val="0"/>
-          <w:numId w:val="4"/>
+          <w:numId w:val="3"/>
         </w:numPr>
         <w:spacing w:after="70" w:line="264"/>
       </w:pPr>
@@ -7014,7 +7649,7 @@
         <w:pStyle w:val="ListParagraph"/>
         <w:numPr>
           <w:ilvl w:val="0"/>
-          <w:numId w:val="4"/>
+          <w:numId w:val="3"/>
         </w:numPr>
         <w:spacing w:after="70" w:line="264"/>
       </w:pPr>
@@ -8451,7 +9086,7 @@
         <w:pStyle w:val="ListParagraph"/>
         <w:numPr>
           <w:ilvl w:val="0"/>
-          <w:numId w:val="4"/>
+          <w:numId w:val="3"/>
         </w:numPr>
         <w:spacing w:after="70" w:line="264"/>
       </w:pPr>
@@ -8481,7 +9116,7 @@
         <w:pStyle w:val="ListParagraph"/>
         <w:numPr>
           <w:ilvl w:val="0"/>
-          <w:numId w:val="4"/>
+          <w:numId w:val="3"/>
         </w:numPr>
         <w:spacing w:after="70" w:line="264"/>
       </w:pPr>
@@ -8511,7 +9146,7 @@
         <w:pStyle w:val="ListParagraph"/>
         <w:numPr>
           <w:ilvl w:val="0"/>
-          <w:numId w:val="4"/>
+          <w:numId w:val="3"/>
         </w:numPr>
         <w:spacing w:after="70" w:line="264"/>
       </w:pPr>
@@ -8541,7 +9176,7 @@
         <w:pStyle w:val="ListParagraph"/>
         <w:numPr>
           <w:ilvl w:val="0"/>
-          <w:numId w:val="4"/>
+          <w:numId w:val="3"/>
         </w:numPr>
         <w:spacing w:after="70" w:line="264"/>
       </w:pPr>
@@ -8884,6 +9519,150 @@
                 <w:sz w:val="17"/>
                 <w:szCs w:val="17"/>
               </w:rPr>
+              <w:t xml:space="preserve">Insights across documents</w:t>
+            </w:r>
+          </w:p>
+        </w:tc>
+        <w:tc>
+          <w:tcPr>
+            <w:tcW w:type="dxa" w:w="7748"/>
+            <w:tcBorders>
+              <w:top w:val="single" w:color="D9D9D9" w:sz="4"/>
+              <w:left w:val="single" w:color="D9D9D9" w:sz="4"/>
+              <w:bottom w:val="single" w:color="D9D9D9" w:sz="4"/>
+              <w:right w:val="single" w:color="D9D9D9" w:sz="4"/>
+            </w:tcBorders>
+            <w:tcMar>
+              <w:top w:type="dxa" w:w="70"/>
+              <w:left w:type="dxa" w:w="100"/>
+              <w:bottom w:type="dxa" w:w="50"/>
+              <w:right w:type="dxa" w:w="100"/>
+            </w:tcMar>
+          </w:tcPr>
+          <w:p>
+            <w:pPr>
+              <w:spacing w:after="40" w:line="252"/>
+            </w:pPr>
+            <w:r>
+              <w:rPr>
+                <w:rFonts w:ascii="Poppins" w:cs="Poppins" w:eastAsia="Poppins" w:hAnsi="Poppins"/>
+                <w:b w:val="false"/>
+                <w:bCs w:val="false"/>
+                <w:color w:val="1A1A1A"/>
+                <w:sz w:val="17"/>
+                <w:szCs w:val="17"/>
+              </w:rPr>
+              <w:t xml:space="preserve">A summary of recurring themes across past proposal debriefs cites each debrief by name and date, and counts how many debriefs raise each theme rather than describing it as “common.”</w:t>
+            </w:r>
+          </w:p>
+        </w:tc>
+      </w:tr>
+      <w:tr>
+        <w:trPr>
+          <w:cantSplit/>
+        </w:trPr>
+        <w:tc>
+          <w:tcPr>
+            <w:tcW w:type="dxa" w:w="1900"/>
+            <w:tcBorders>
+              <w:top w:val="single" w:color="D9D9D9" w:sz="4"/>
+              <w:left w:val="single" w:color="D9D9D9" w:sz="4"/>
+              <w:bottom w:val="single" w:color="D9D9D9" w:sz="4"/>
+              <w:right w:val="single" w:color="D9D9D9" w:sz="4"/>
+            </w:tcBorders>
+            <w:shd w:fill="F6F8FA" w:color="auto" w:val="clear"/>
+            <w:tcMar>
+              <w:top w:type="dxa" w:w="70"/>
+              <w:left w:type="dxa" w:w="100"/>
+              <w:bottom w:type="dxa" w:w="50"/>
+              <w:right w:type="dxa" w:w="100"/>
+            </w:tcMar>
+          </w:tcPr>
+          <w:p>
+            <w:pPr>
+              <w:spacing w:after="40" w:line="252"/>
+            </w:pPr>
+            <w:r>
+              <w:rPr>
+                <w:rFonts w:ascii="Poppins" w:cs="Poppins" w:eastAsia="Poppins" w:hAnsi="Poppins"/>
+                <w:b/>
+                <w:bCs/>
+                <w:color w:val="1A1A1A"/>
+                <w:sz w:val="17"/>
+                <w:szCs w:val="17"/>
+              </w:rPr>
+              <w:t xml:space="preserve">Skills</w:t>
+            </w:r>
+          </w:p>
+        </w:tc>
+        <w:tc>
+          <w:tcPr>
+            <w:tcW w:type="dxa" w:w="7748"/>
+            <w:tcBorders>
+              <w:top w:val="single" w:color="D9D9D9" w:sz="4"/>
+              <w:left w:val="single" w:color="D9D9D9" w:sz="4"/>
+              <w:bottom w:val="single" w:color="D9D9D9" w:sz="4"/>
+              <w:right w:val="single" w:color="D9D9D9" w:sz="4"/>
+            </w:tcBorders>
+            <w:shd w:fill="F6F8FA" w:color="auto" w:val="clear"/>
+            <w:tcMar>
+              <w:top w:type="dxa" w:w="70"/>
+              <w:left w:type="dxa" w:w="100"/>
+              <w:bottom w:type="dxa" w:w="50"/>
+              <w:right w:type="dxa" w:w="100"/>
+            </w:tcMar>
+          </w:tcPr>
+          <w:p>
+            <w:pPr>
+              <w:spacing w:after="40" w:line="252"/>
+            </w:pPr>
+            <w:r>
+              <w:rPr>
+                <w:rFonts w:ascii="Poppins" w:cs="Poppins" w:eastAsia="Poppins" w:hAnsi="Poppins"/>
+                <w:b w:val="false"/>
+                <w:bCs w:val="false"/>
+                <w:color w:val="1A1A1A"/>
+                <w:sz w:val="17"/>
+                <w:szCs w:val="17"/>
+              </w:rPr>
+              <w:t xml:space="preserve">A proposal-review skill leads with a description of when to use it and when not to, explains the reason behind each review rule, and ends every review with the agent recording what it learned for the next review.</w:t>
+            </w:r>
+          </w:p>
+        </w:tc>
+      </w:tr>
+      <w:tr>
+        <w:trPr>
+          <w:cantSplit/>
+        </w:trPr>
+        <w:tc>
+          <w:tcPr>
+            <w:tcW w:type="dxa" w:w="1900"/>
+            <w:tcBorders>
+              <w:top w:val="single" w:color="D9D9D9" w:sz="4"/>
+              <w:left w:val="single" w:color="D9D9D9" w:sz="4"/>
+              <w:bottom w:val="single" w:color="D9D9D9" w:sz="4"/>
+              <w:right w:val="single" w:color="D9D9D9" w:sz="4"/>
+            </w:tcBorders>
+            <w:tcMar>
+              <w:top w:type="dxa" w:w="70"/>
+              <w:left w:type="dxa" w:w="100"/>
+              <w:bottom w:type="dxa" w:w="50"/>
+              <w:right w:type="dxa" w:w="100"/>
+            </w:tcMar>
+          </w:tcPr>
+          <w:p>
+            <w:pPr>
+              <w:spacing w:after="40" w:line="252"/>
+            </w:pPr>
+            <w:r>
+              <w:rPr>
+                <w:rFonts w:ascii="Poppins" w:cs="Poppins" w:eastAsia="Poppins" w:hAnsi="Poppins"/>
+                <w:b/>
+                <w:bCs/>
+                <w:color w:val="1A1A1A"/>
+                <w:sz w:val="17"/>
+                <w:szCs w:val="17"/>
+              </w:rPr>
               <w:t xml:space="preserve">L1, L3</w:t>
             </w:r>
           </w:p>
@@ -9689,6 +10468,217 @@
                 <w:szCs w:val="17"/>
               </w:rPr>
               <w:t xml:space="preserve">2026-07 (practice), 2026-10-09 (notes)</w:t>
+            </w:r>
+          </w:p>
+        </w:tc>
+      </w:tr>
+      <w:tr>
+        <w:trPr>
+          <w:cantSplit/>
+        </w:trPr>
+        <w:tc>
+          <w:tcPr>
+            <w:tcW w:type="dxa" w:w="1900"/>
+            <w:tcBorders>
+              <w:top w:val="single" w:color="D9D9D9" w:sz="4"/>
+              <w:left w:val="single" w:color="D9D9D9" w:sz="4"/>
+              <w:bottom w:val="single" w:color="D9D9D9" w:sz="4"/>
+              <w:right w:val="single" w:color="D9D9D9" w:sz="4"/>
+            </w:tcBorders>
+            <w:shd w:fill="F6F8FA" w:color="auto" w:val="clear"/>
+            <w:tcMar>
+              <w:top w:type="dxa" w:w="70"/>
+              <w:left w:type="dxa" w:w="100"/>
+              <w:bottom w:type="dxa" w:w="50"/>
+              <w:right w:type="dxa" w:w="100"/>
+            </w:tcMar>
+          </w:tcPr>
+          <w:p>
+            <w:pPr>
+              <w:spacing w:after="40" w:line="252"/>
+            </w:pPr>
+            <w:r>
+              <w:rPr>
+                <w:rFonts w:ascii="Poppins" w:cs="Poppins" w:eastAsia="Poppins" w:hAnsi="Poppins"/>
+                <w:b/>
+                <w:bCs/>
+                <w:color w:val="1A1A1A"/>
+                <w:sz w:val="17"/>
+                <w:szCs w:val="17"/>
+              </w:rPr>
+              <w:t xml:space="preserve">Section 2, data</w:t>
+            </w:r>
+          </w:p>
+        </w:tc>
+        <w:tc>
+          <w:tcPr>
+            <w:tcW w:type="dxa" w:w="5848"/>
+            <w:tcBorders>
+              <w:top w:val="single" w:color="D9D9D9" w:sz="4"/>
+              <w:left w:val="single" w:color="D9D9D9" w:sz="4"/>
+              <w:bottom w:val="single" w:color="D9D9D9" w:sz="4"/>
+              <w:right w:val="single" w:color="D9D9D9" w:sz="4"/>
+            </w:tcBorders>
+            <w:shd w:fill="F6F8FA" w:color="auto" w:val="clear"/>
+            <w:tcMar>
+              <w:top w:type="dxa" w:w="70"/>
+              <w:left w:type="dxa" w:w="100"/>
+              <w:bottom w:type="dxa" w:w="50"/>
+              <w:right w:type="dxa" w:w="100"/>
+            </w:tcMar>
+          </w:tcPr>
+          <w:p>
+            <w:pPr>
+              <w:spacing w:after="40" w:line="252"/>
+            </w:pPr>
+            <w:r>
+              <w:rPr>
+                <w:rFonts w:ascii="Poppins" w:cs="Poppins" w:eastAsia="Poppins" w:hAnsi="Poppins"/>
+                <w:b w:val="false"/>
+                <w:bCs w:val="false"/>
+                <w:color w:val="1A1A1A"/>
+                <w:sz w:val="17"/>
+                <w:szCs w:val="17"/>
+              </w:rPr>
+              <w:t xml:space="preserve">Historical statistics kept only where two independent sources agree within rounding; conflicts listed beside the record; raw pages pinned by hash</w:t>
+            </w:r>
+          </w:p>
+        </w:tc>
+        <w:tc>
+          <w:tcPr>
+            <w:tcW w:type="dxa" w:w="1900"/>
+            <w:tcBorders>
+              <w:top w:val="single" w:color="D9D9D9" w:sz="4"/>
+              <w:left w:val="single" w:color="D9D9D9" w:sz="4"/>
+              <w:bottom w:val="single" w:color="D9D9D9" w:sz="4"/>
+              <w:right w:val="single" w:color="D9D9D9" w:sz="4"/>
+            </w:tcBorders>
+            <w:shd w:fill="F6F8FA" w:color="auto" w:val="clear"/>
+            <w:tcMar>
+              <w:top w:type="dxa" w:w="70"/>
+              <w:left w:type="dxa" w:w="100"/>
+              <w:bottom w:type="dxa" w:w="50"/>
+              <w:right w:type="dxa" w:w="100"/>
+            </w:tcMar>
+          </w:tcPr>
+          <w:p>
+            <w:pPr>
+              <w:spacing w:after="40" w:line="252"/>
+            </w:pPr>
+            <w:r>
+              <w:rPr>
+                <w:rFonts w:ascii="Poppins" w:cs="Poppins" w:eastAsia="Poppins" w:hAnsi="Poppins"/>
+                <w:b w:val="false"/>
+                <w:bCs w:val="false"/>
+                <w:color w:val="1A1A1A"/>
+                <w:sz w:val="17"/>
+                <w:szCs w:val="17"/>
+              </w:rPr>
+              <w:t xml:space="preserve">2026-10-09</w:t>
+            </w:r>
+          </w:p>
+        </w:tc>
+      </w:tr>
+      <w:tr>
+        <w:trPr>
+          <w:cantSplit/>
+        </w:trPr>
+        <w:tc>
+          <w:tcPr>
+            <w:tcW w:type="dxa" w:w="1900"/>
+            <w:tcBorders>
+              <w:top w:val="single" w:color="D9D9D9" w:sz="4"/>
+              <w:left w:val="single" w:color="D9D9D9" w:sz="4"/>
+              <w:bottom w:val="single" w:color="D9D9D9" w:sz="4"/>
+              <w:right w:val="single" w:color="D9D9D9" w:sz="4"/>
+            </w:tcBorders>
+            <w:tcMar>
+              <w:top w:type="dxa" w:w="70"/>
+              <w:left w:type="dxa" w:w="100"/>
+              <w:bottom w:type="dxa" w:w="50"/>
+              <w:right w:type="dxa" w:w="100"/>
+            </w:tcMar>
+          </w:tcPr>
+          <w:p>
+            <w:pPr>
+              <w:spacing w:after="40" w:line="252"/>
+            </w:pPr>
+            <w:r>
+              <w:rPr>
+                <w:rFonts w:ascii="Poppins" w:cs="Poppins" w:eastAsia="Poppins" w:hAnsi="Poppins"/>
+                <w:b/>
+                <w:bCs/>
+                <w:color w:val="1A1A1A"/>
+                <w:sz w:val="17"/>
+                <w:szCs w:val="17"/>
+              </w:rPr>
+              <w:t xml:space="preserve">Section 2, skills</w:t>
+            </w:r>
+          </w:p>
+        </w:tc>
+        <w:tc>
+          <w:tcPr>
+            <w:tcW w:type="dxa" w:w="5848"/>
+            <w:tcBorders>
+              <w:top w:val="single" w:color="D9D9D9" w:sz="4"/>
+              <w:left w:val="single" w:color="D9D9D9" w:sz="4"/>
+              <w:bottom w:val="single" w:color="D9D9D9" w:sz="4"/>
+              <w:right w:val="single" w:color="D9D9D9" w:sz="4"/>
+            </w:tcBorders>
+            <w:tcMar>
+              <w:top w:type="dxa" w:w="70"/>
+              <w:left w:type="dxa" w:w="100"/>
+              <w:bottom w:type="dxa" w:w="50"/>
+              <w:right w:type="dxa" w:w="100"/>
+            </w:tcMar>
+          </w:tcPr>
+          <w:p>
+            <w:pPr>
+              <w:spacing w:after="40" w:line="252"/>
+            </w:pPr>
+            <w:r>
+              <w:rPr>
+                <w:rFonts w:ascii="Poppins" w:cs="Poppins" w:eastAsia="Poppins" w:hAnsi="Poppins"/>
+                <w:b w:val="false"/>
+                <w:bCs w:val="false"/>
+                <w:color w:val="1A1A1A"/>
+                <w:sz w:val="17"/>
+                <w:szCs w:val="17"/>
+              </w:rPr>
+              <w:t xml:space="preserve">The library's authoring standard: description as the trigger, a “when not to use” clause in every module, rules with their reasons; dated amendments; the failure ledger; pre-registered tests</w:t>
+            </w:r>
+          </w:p>
+        </w:tc>
+        <w:tc>
+          <w:tcPr>
+            <w:tcW w:type="dxa" w:w="1900"/>
+            <w:tcBorders>
+              <w:top w:val="single" w:color="D9D9D9" w:sz="4"/>
+              <w:left w:val="single" w:color="D9D9D9" w:sz="4"/>
+              <w:bottom w:val="single" w:color="D9D9D9" w:sz="4"/>
+              <w:right w:val="single" w:color="D9D9D9" w:sz="4"/>
+            </w:tcBorders>
+            <w:tcMar>
+              <w:top w:type="dxa" w:w="70"/>
+              <w:left w:type="dxa" w:w="100"/>
+              <w:bottom w:type="dxa" w:w="50"/>
+              <w:right w:type="dxa" w:w="100"/>
+            </w:tcMar>
+          </w:tcPr>
+          <w:p>
+            <w:pPr>
+              <w:spacing w:after="40" w:line="252"/>
+            </w:pPr>
+            <w:r>
+              <w:rPr>
+                <w:rFonts w:ascii="Poppins" w:cs="Poppins" w:eastAsia="Poppins" w:hAnsi="Poppins"/>
+                <w:b w:val="false"/>
+                <w:bCs w:val="false"/>
+                <w:color w:val="1A1A1A"/>
+                <w:sz w:val="17"/>
+                <w:szCs w:val="17"/>
+              </w:rPr>
+              <w:t xml:space="preserve">2026-07-11 onward</w:t>
             </w:r>
           </w:p>
         </w:tc>
@@ -12379,6 +13369,23 @@
       </w:rPr>
     </w:lvl>
   </w:abstractNum>
+  <w:abstractNum w:abstractNumId="5" w15:restartNumberingAfterBreak="0">
+    <w:multiLevelType w:val="hybridMultilevel"/>
+    <w:lvl w:ilvl="0" w15:tentative="1">
+      <w:start w:val="1"/>
+      <w:numFmt w:val="decimal"/>
+      <w:lvlText w:val="%1."/>
+      <w:lvlJc w:val="left"/>
+      <w:pPr>
+        <w:ind w:left="400" w:hanging="300"/>
+      </w:pPr>
+      <w:rPr>
+        <w:b/>
+        <w:bCs/>
+        <w:color w:val="0F436E"/>
+      </w:rPr>
+    </w:lvl>
+  </w:abstractNum>
   <w:num w:numId="1">
     <w:abstractNumId w:val="1"/>
     <w:lvlOverride w:ilvl="0">
@@ -12392,13 +13399,19 @@
     </w:lvlOverride>
   </w:num>
   <w:num w:numId="3">
+    <w:abstractNumId w:val="2"/>
+    <w:lvlOverride w:ilvl="0">
+      <w:startOverride w:val="1"/>
+    </w:lvlOverride>
+  </w:num>
+  <w:num w:numId="4">
     <w:abstractNumId w:val="4"/>
     <w:lvlOverride w:ilvl="0">
       <w:startOverride w:val="1"/>
     </w:lvlOverride>
   </w:num>
-  <w:num w:numId="4">
-    <w:abstractNumId w:val="2"/>
+  <w:num w:numId="5">
+    <w:abstractNumId w:val="5"/>
     <w:lvlOverride w:ilvl="0">
       <w:startOverride w:val="1"/>
     </w:lvlOverride>

</xml_diff>

<commit_message>
Close Section 2 with "3 habits that compound"; guard PDF row parity
Adds David's final note: Prompting, Skill Building, and Collaboration, each
mapped to where it lives in the standard, with one closing sentence on why
they compound. Owner wording verbatim except "SKill" -> "Skill".

The addition exposed a converter defect: LibreOffice dropped laws L2-L10 from
the PDF where the laws table split across a page, while the .docx held all
ten. Section 3 now starts on a fresh page, and check_row_parity.py fails any
render that loses a bolded lead from the source. It catches the broken render,
passes the previously pushed PDF, and passes the final one; two conversions
produce identical text; guard passes.

Co-Authored-By: Claude Opus 5.5 <noreply@anthropic.com>
Claude-Session: https://claude.ai/code/session_01AYc6fhZNmvyoAQ67RgbJuK
</commit_message>
<xml_diff>
--- a/results/2026-10-09/ai-rules-of-engagement/Rules-of-Engagement-Operational-AI_2026-10-09.docx
+++ b/results/2026-10-09/ai-rules-of-engagement/Rules-of-Engagement-Operational-AI_2026-10-09.docx
@@ -1839,6 +1839,499 @@
           <w:szCs w:val="20"/>
         </w:rPr>
         <w:t xml:space="preserve"> The governance library behind this standard is built this way. All 21 of its modules lead with a description that states when to use the module and when not to, and the repository's guard checks every description on every change. Rules in the governance modules carry their reasons. Improvements are recorded as dated amendments that name the incident behind them, and a 30-entry ledger records failures, dead ends, and wins as symptom, root cause, evidence, and status. Trigger accuracy is measured, not assumed (Section 8).</w:t>
+      </w:r>
+    </w:p>
+    <w:p>
+      <w:pPr>
+        <w:pStyle w:val="Heading2"/>
+        <w:keepNext/>
+        <w:spacing w:after="80" w:before="200"/>
+      </w:pPr>
+      <w:r>
+        <w:rPr>
+          <w:rFonts w:ascii="Eurostile" w:cs="Eurostile" w:eastAsia="Eurostile" w:hAnsi="Eurostile"/>
+          <w:b/>
+          <w:bCs/>
+          <w:color w:val="0F436E"/>
+          <w:sz w:val="23"/>
+          <w:szCs w:val="23"/>
+        </w:rPr>
+        <w:t xml:space="preserve">3 habits that compound</w:t>
+      </w:r>
+    </w:p>
+    <w:p>
+      <w:pPr>
+        <w:keepNext/>
+        <w:spacing w:after="120" w:before="0" w:line="276"/>
+      </w:pPr>
+      <w:r>
+        <w:rPr>
+          <w:rFonts w:ascii="Poppins" w:cs="Poppins" w:eastAsia="Poppins" w:hAnsi="Poppins"/>
+          <w:color w:val="1A1A1A"/>
+          <w:sz w:val="20"/>
+          <w:szCs w:val="20"/>
+        </w:rPr>
+        <w:t xml:space="preserve">The three practices above become habits through repetition, and each habit makes the next one stronger.</w:t>
+      </w:r>
+    </w:p>
+    <w:tbl>
+      <w:tblPr>
+        <w:tblW w:type="dxa" w:w="9648"/>
+        <w:tblBorders>
+          <w:top w:val="single" w:color="auto" w:sz="4"/>
+          <w:left w:val="single" w:color="auto" w:sz="4"/>
+          <w:bottom w:val="single" w:color="auto" w:sz="4"/>
+          <w:right w:val="single" w:color="auto" w:sz="4"/>
+          <w:insideH w:val="single" w:color="auto" w:sz="4"/>
+          <w:insideV w:val="single" w:color="auto" w:sz="4"/>
+        </w:tblBorders>
+        <w:tblLayout w:type="fixed"/>
+      </w:tblPr>
+      <w:tblGrid>
+        <w:gridCol w:w="1900"/>
+        <w:gridCol w:w="5248"/>
+        <w:gridCol w:w="2500"/>
+      </w:tblGrid>
+      <w:tr>
+        <w:trPr>
+          <w:tblHeader/>
+        </w:trPr>
+        <w:tc>
+          <w:tcPr>
+            <w:tcW w:type="dxa" w:w="1900"/>
+            <w:tcBorders>
+              <w:top w:val="single" w:color="D9D9D9" w:sz="4"/>
+              <w:left w:val="single" w:color="D9D9D9" w:sz="4"/>
+              <w:bottom w:val="single" w:color="D9D9D9" w:sz="4"/>
+              <w:right w:val="single" w:color="D9D9D9" w:sz="4"/>
+            </w:tcBorders>
+            <w:shd w:fill="0F436E" w:color="auto" w:val="clear"/>
+            <w:tcMar>
+              <w:top w:type="dxa" w:w="70"/>
+              <w:left w:type="dxa" w:w="100"/>
+              <w:bottom w:type="dxa" w:w="50"/>
+              <w:right w:type="dxa" w:w="100"/>
+            </w:tcMar>
+          </w:tcPr>
+          <w:p>
+            <w:pPr>
+              <w:spacing w:after="40" w:line="252"/>
+            </w:pPr>
+            <w:r>
+              <w:rPr>
+                <w:rFonts w:ascii="Eurostile" w:cs="Eurostile" w:eastAsia="Eurostile" w:hAnsi="Eurostile"/>
+                <w:b/>
+                <w:bCs/>
+                <w:color w:val="FFFFFF"/>
+                <w:sz w:val="17"/>
+                <w:szCs w:val="17"/>
+              </w:rPr>
+              <w:t xml:space="preserve">Habit</w:t>
+            </w:r>
+          </w:p>
+        </w:tc>
+        <w:tc>
+          <w:tcPr>
+            <w:tcW w:type="dxa" w:w="5248"/>
+            <w:tcBorders>
+              <w:top w:val="single" w:color="D9D9D9" w:sz="4"/>
+              <w:left w:val="single" w:color="D9D9D9" w:sz="4"/>
+              <w:bottom w:val="single" w:color="D9D9D9" w:sz="4"/>
+              <w:right w:val="single" w:color="D9D9D9" w:sz="4"/>
+            </w:tcBorders>
+            <w:shd w:fill="0F436E" w:color="auto" w:val="clear"/>
+            <w:tcMar>
+              <w:top w:type="dxa" w:w="70"/>
+              <w:left w:type="dxa" w:w="100"/>
+              <w:bottom w:type="dxa" w:w="50"/>
+              <w:right w:type="dxa" w:w="100"/>
+            </w:tcMar>
+          </w:tcPr>
+          <w:p>
+            <w:pPr>
+              <w:spacing w:after="40" w:line="252"/>
+            </w:pPr>
+            <w:r>
+              <w:rPr>
+                <w:rFonts w:ascii="Eurostile" w:cs="Eurostile" w:eastAsia="Eurostile" w:hAnsi="Eurostile"/>
+                <w:b/>
+                <w:bCs/>
+                <w:color w:val="FFFFFF"/>
+                <w:sz w:val="17"/>
+                <w:szCs w:val="17"/>
+              </w:rPr>
+              <w:t xml:space="preserve">What it looks like</w:t>
+            </w:r>
+          </w:p>
+        </w:tc>
+        <w:tc>
+          <w:tcPr>
+            <w:tcW w:type="dxa" w:w="2500"/>
+            <w:tcBorders>
+              <w:top w:val="single" w:color="D9D9D9" w:sz="4"/>
+              <w:left w:val="single" w:color="D9D9D9" w:sz="4"/>
+              <w:bottom w:val="single" w:color="D9D9D9" w:sz="4"/>
+              <w:right w:val="single" w:color="D9D9D9" w:sz="4"/>
+            </w:tcBorders>
+            <w:shd w:fill="0F436E" w:color="auto" w:val="clear"/>
+            <w:tcMar>
+              <w:top w:type="dxa" w:w="70"/>
+              <w:left w:type="dxa" w:w="100"/>
+              <w:bottom w:type="dxa" w:w="50"/>
+              <w:right w:type="dxa" w:w="100"/>
+            </w:tcMar>
+          </w:tcPr>
+          <w:p>
+            <w:pPr>
+              <w:spacing w:after="40" w:line="252"/>
+            </w:pPr>
+            <w:r>
+              <w:rPr>
+                <w:rFonts w:ascii="Eurostile" w:cs="Eurostile" w:eastAsia="Eurostile" w:hAnsi="Eurostile"/>
+                <w:b/>
+                <w:bCs/>
+                <w:color w:val="FFFFFF"/>
+                <w:sz w:val="17"/>
+                <w:szCs w:val="17"/>
+              </w:rPr>
+              <w:t xml:space="preserve">Where it lives</w:t>
+            </w:r>
+          </w:p>
+        </w:tc>
+      </w:tr>
+      <w:tr>
+        <w:trPr>
+          <w:cantSplit/>
+        </w:trPr>
+        <w:tc>
+          <w:tcPr>
+            <w:tcW w:type="dxa" w:w="1900"/>
+            <w:tcBorders>
+              <w:top w:val="single" w:color="D9D9D9" w:sz="4"/>
+              <w:left w:val="single" w:color="D9D9D9" w:sz="4"/>
+              <w:bottom w:val="single" w:color="D9D9D9" w:sz="4"/>
+              <w:right w:val="single" w:color="D9D9D9" w:sz="4"/>
+            </w:tcBorders>
+            <w:tcMar>
+              <w:top w:type="dxa" w:w="70"/>
+              <w:left w:type="dxa" w:w="100"/>
+              <w:bottom w:type="dxa" w:w="50"/>
+              <w:right w:type="dxa" w:w="100"/>
+            </w:tcMar>
+          </w:tcPr>
+          <w:p>
+            <w:pPr>
+              <w:spacing w:after="40" w:line="252"/>
+            </w:pPr>
+            <w:r>
+              <w:rPr>
+                <w:rFonts w:ascii="Poppins" w:cs="Poppins" w:eastAsia="Poppins" w:hAnsi="Poppins"/>
+                <w:b/>
+                <w:bCs/>
+                <w:color w:val="1A1A1A"/>
+                <w:sz w:val="17"/>
+                <w:szCs w:val="17"/>
+              </w:rPr>
+              <w:t xml:space="preserve">Prompting</w:t>
+            </w:r>
+          </w:p>
+        </w:tc>
+        <w:tc>
+          <w:tcPr>
+            <w:tcW w:type="dxa" w:w="5248"/>
+            <w:tcBorders>
+              <w:top w:val="single" w:color="D9D9D9" w:sz="4"/>
+              <w:left w:val="single" w:color="D9D9D9" w:sz="4"/>
+              <w:bottom w:val="single" w:color="D9D9D9" w:sz="4"/>
+              <w:right w:val="single" w:color="D9D9D9" w:sz="4"/>
+            </w:tcBorders>
+            <w:tcMar>
+              <w:top w:type="dxa" w:w="70"/>
+              <w:left w:type="dxa" w:w="100"/>
+              <w:bottom w:type="dxa" w:w="50"/>
+              <w:right w:type="dxa" w:w="100"/>
+            </w:tcMar>
+          </w:tcPr>
+          <w:p>
+            <w:pPr>
+              <w:spacing w:after="40" w:line="252"/>
+            </w:pPr>
+            <w:r>
+              <w:rPr>
+                <w:rFonts w:ascii="Poppins" w:cs="Poppins" w:eastAsia="Poppins" w:hAnsi="Poppins"/>
+                <w:b w:val="false"/>
+                <w:bCs w:val="false"/>
+                <w:color w:val="1A1A1A"/>
+                <w:sz w:val="17"/>
+                <w:szCs w:val="17"/>
+              </w:rPr>
+              <w:t xml:space="preserve">Every task starts with a full brief: persona, task, context, and format. Gaps in the brief show exactly what context is missing.</w:t>
+            </w:r>
+          </w:p>
+        </w:tc>
+        <w:tc>
+          <w:tcPr>
+            <w:tcW w:type="dxa" w:w="2500"/>
+            <w:tcBorders>
+              <w:top w:val="single" w:color="D9D9D9" w:sz="4"/>
+              <w:left w:val="single" w:color="D9D9D9" w:sz="4"/>
+              <w:bottom w:val="single" w:color="D9D9D9" w:sz="4"/>
+              <w:right w:val="single" w:color="D9D9D9" w:sz="4"/>
+            </w:tcBorders>
+            <w:tcMar>
+              <w:top w:type="dxa" w:w="70"/>
+              <w:left w:type="dxa" w:w="100"/>
+              <w:bottom w:type="dxa" w:w="50"/>
+              <w:right w:type="dxa" w:w="100"/>
+            </w:tcMar>
+          </w:tcPr>
+          <w:p>
+            <w:pPr>
+              <w:spacing w:after="40" w:line="252"/>
+            </w:pPr>
+            <w:r>
+              <w:rPr>
+                <w:rFonts w:ascii="Poppins" w:cs="Poppins" w:eastAsia="Poppins" w:hAnsi="Poppins"/>
+                <w:b w:val="false"/>
+                <w:bCs w:val="false"/>
+                <w:color w:val="1A1A1A"/>
+                <w:sz w:val="17"/>
+                <w:szCs w:val="17"/>
+              </w:rPr>
+              <w:t xml:space="preserve">The four-part brief, above</w:t>
+            </w:r>
+          </w:p>
+        </w:tc>
+      </w:tr>
+      <w:tr>
+        <w:trPr>
+          <w:cantSplit/>
+        </w:trPr>
+        <w:tc>
+          <w:tcPr>
+            <w:tcW w:type="dxa" w:w="1900"/>
+            <w:tcBorders>
+              <w:top w:val="single" w:color="D9D9D9" w:sz="4"/>
+              <w:left w:val="single" w:color="D9D9D9" w:sz="4"/>
+              <w:bottom w:val="single" w:color="D9D9D9" w:sz="4"/>
+              <w:right w:val="single" w:color="D9D9D9" w:sz="4"/>
+            </w:tcBorders>
+            <w:shd w:fill="F6F8FA" w:color="auto" w:val="clear"/>
+            <w:tcMar>
+              <w:top w:type="dxa" w:w="70"/>
+              <w:left w:type="dxa" w:w="100"/>
+              <w:bottom w:type="dxa" w:w="50"/>
+              <w:right w:type="dxa" w:w="100"/>
+            </w:tcMar>
+          </w:tcPr>
+          <w:p>
+            <w:pPr>
+              <w:spacing w:after="40" w:line="252"/>
+            </w:pPr>
+            <w:r>
+              <w:rPr>
+                <w:rFonts w:ascii="Poppins" w:cs="Poppins" w:eastAsia="Poppins" w:hAnsi="Poppins"/>
+                <w:b/>
+                <w:bCs/>
+                <w:color w:val="1A1A1A"/>
+                <w:sz w:val="17"/>
+                <w:szCs w:val="17"/>
+              </w:rPr>
+              <w:t xml:space="preserve">Skill Building</w:t>
+            </w:r>
+          </w:p>
+        </w:tc>
+        <w:tc>
+          <w:tcPr>
+            <w:tcW w:type="dxa" w:w="5248"/>
+            <w:tcBorders>
+              <w:top w:val="single" w:color="D9D9D9" w:sz="4"/>
+              <w:left w:val="single" w:color="D9D9D9" w:sz="4"/>
+              <w:bottom w:val="single" w:color="D9D9D9" w:sz="4"/>
+              <w:right w:val="single" w:color="D9D9D9" w:sz="4"/>
+            </w:tcBorders>
+            <w:shd w:fill="F6F8FA" w:color="auto" w:val="clear"/>
+            <w:tcMar>
+              <w:top w:type="dxa" w:w="70"/>
+              <w:left w:type="dxa" w:w="100"/>
+              <w:bottom w:type="dxa" w:w="50"/>
+              <w:right w:type="dxa" w:w="100"/>
+            </w:tcMar>
+          </w:tcPr>
+          <w:p>
+            <w:pPr>
+              <w:spacing w:after="40" w:line="252"/>
+            </w:pPr>
+            <w:r>
+              <w:rPr>
+                <w:rFonts w:ascii="Poppins" w:cs="Poppins" w:eastAsia="Poppins" w:hAnsi="Poppins"/>
+                <w:b w:val="false"/>
+                <w:bCs w:val="false"/>
+                <w:color w:val="1A1A1A"/>
+                <w:sz w:val="17"/>
+                <w:szCs w:val="17"/>
+              </w:rPr>
+              <w:t xml:space="preserve">The context a good brief needed once is written into a skill, so the next task starts from it instead of from nothing.</w:t>
+            </w:r>
+          </w:p>
+        </w:tc>
+        <w:tc>
+          <w:tcPr>
+            <w:tcW w:type="dxa" w:w="2500"/>
+            <w:tcBorders>
+              <w:top w:val="single" w:color="D9D9D9" w:sz="4"/>
+              <w:left w:val="single" w:color="D9D9D9" w:sz="4"/>
+              <w:bottom w:val="single" w:color="D9D9D9" w:sz="4"/>
+              <w:right w:val="single" w:color="D9D9D9" w:sz="4"/>
+            </w:tcBorders>
+            <w:shd w:fill="F6F8FA" w:color="auto" w:val="clear"/>
+            <w:tcMar>
+              <w:top w:type="dxa" w:w="70"/>
+              <w:left w:type="dxa" w:w="100"/>
+              <w:bottom w:type="dxa" w:w="50"/>
+              <w:right w:type="dxa" w:w="100"/>
+            </w:tcMar>
+          </w:tcPr>
+          <w:p>
+            <w:pPr>
+              <w:spacing w:after="40" w:line="252"/>
+            </w:pPr>
+            <w:r>
+              <w:rPr>
+                <w:rFonts w:ascii="Poppins" w:cs="Poppins" w:eastAsia="Poppins" w:hAnsi="Poppins"/>
+                <w:b w:val="false"/>
+                <w:bCs w:val="false"/>
+                <w:color w:val="1A1A1A"/>
+                <w:sz w:val="17"/>
+                <w:szCs w:val="17"/>
+              </w:rPr>
+              <w:t xml:space="preserve">Agent Building: Skills, above</w:t>
+            </w:r>
+          </w:p>
+        </w:tc>
+      </w:tr>
+      <w:tr>
+        <w:trPr>
+          <w:cantSplit/>
+        </w:trPr>
+        <w:tc>
+          <w:tcPr>
+            <w:tcW w:type="dxa" w:w="1900"/>
+            <w:tcBorders>
+              <w:top w:val="single" w:color="D9D9D9" w:sz="4"/>
+              <w:left w:val="single" w:color="D9D9D9" w:sz="4"/>
+              <w:bottom w:val="single" w:color="D9D9D9" w:sz="4"/>
+              <w:right w:val="single" w:color="D9D9D9" w:sz="4"/>
+            </w:tcBorders>
+            <w:tcMar>
+              <w:top w:type="dxa" w:w="70"/>
+              <w:left w:type="dxa" w:w="100"/>
+              <w:bottom w:type="dxa" w:w="50"/>
+              <w:right w:type="dxa" w:w="100"/>
+            </w:tcMar>
+          </w:tcPr>
+          <w:p>
+            <w:pPr>
+              <w:spacing w:after="40" w:line="252"/>
+            </w:pPr>
+            <w:r>
+              <w:rPr>
+                <w:rFonts w:ascii="Poppins" w:cs="Poppins" w:eastAsia="Poppins" w:hAnsi="Poppins"/>
+                <w:b/>
+                <w:bCs/>
+                <w:color w:val="1A1A1A"/>
+                <w:sz w:val="17"/>
+                <w:szCs w:val="17"/>
+              </w:rPr>
+              <w:t xml:space="preserve">Collaboration</w:t>
+            </w:r>
+          </w:p>
+        </w:tc>
+        <w:tc>
+          <w:tcPr>
+            <w:tcW w:type="dxa" w:w="5248"/>
+            <w:tcBorders>
+              <w:top w:val="single" w:color="D9D9D9" w:sz="4"/>
+              <w:left w:val="single" w:color="D9D9D9" w:sz="4"/>
+              <w:bottom w:val="single" w:color="D9D9D9" w:sz="4"/>
+              <w:right w:val="single" w:color="D9D9D9" w:sz="4"/>
+            </w:tcBorders>
+            <w:tcMar>
+              <w:top w:type="dxa" w:w="70"/>
+              <w:left w:type="dxa" w:w="100"/>
+              <w:bottom w:type="dxa" w:w="50"/>
+              <w:right w:type="dxa" w:w="100"/>
+            </w:tcMar>
+          </w:tcPr>
+          <w:p>
+            <w:pPr>
+              <w:spacing w:after="40" w:line="252"/>
+            </w:pPr>
+            <w:r>
+              <w:rPr>
+                <w:rFonts w:ascii="Poppins" w:cs="Poppins" w:eastAsia="Poppins" w:hAnsi="Poppins"/>
+                <w:b w:val="false"/>
+                <w:bCs w:val="false"/>
+                <w:color w:val="1A1A1A"/>
+                <w:sz w:val="17"/>
+                <w:szCs w:val="17"/>
+              </w:rPr>
+              <w:t xml:space="preserve">People and agents share one record: skills, the knowledge base, and the state of the work. Disagreements are surfaced and resolved, never smoothed over.</w:t>
+            </w:r>
+          </w:p>
+        </w:tc>
+        <w:tc>
+          <w:tcPr>
+            <w:tcW w:type="dxa" w:w="2500"/>
+            <w:tcBorders>
+              <w:top w:val="single" w:color="D9D9D9" w:sz="4"/>
+              <w:left w:val="single" w:color="D9D9D9" w:sz="4"/>
+              <w:bottom w:val="single" w:color="D9D9D9" w:sz="4"/>
+              <w:right w:val="single" w:color="D9D9D9" w:sz="4"/>
+            </w:tcBorders>
+            <w:tcMar>
+              <w:top w:type="dxa" w:w="70"/>
+              <w:left w:type="dxa" w:w="100"/>
+              <w:bottom w:type="dxa" w:w="50"/>
+              <w:right w:type="dxa" w:w="100"/>
+            </w:tcMar>
+          </w:tcPr>
+          <w:p>
+            <w:pPr>
+              <w:spacing w:after="40" w:line="252"/>
+            </w:pPr>
+            <w:r>
+              <w:rPr>
+                <w:rFonts w:ascii="Poppins" w:cs="Poppins" w:eastAsia="Poppins" w:hAnsi="Poppins"/>
+                <w:b w:val="false"/>
+                <w:bCs w:val="false"/>
+                <w:color w:val="1A1A1A"/>
+                <w:sz w:val="17"/>
+                <w:szCs w:val="17"/>
+              </w:rPr>
+              <w:t xml:space="preserve">The knowledge base, above; the handshakes (Section 5); Law L9</w:t>
+            </w:r>
+          </w:p>
+        </w:tc>
+      </w:tr>
+    </w:tbl>
+    <w:p>
+      <w:pPr>
+        <w:spacing w:after="120" w:before="120" w:line="276"/>
+      </w:pPr>
+      <w:r>
+        <w:rPr>
+          <w:rFonts w:ascii="Poppins" w:cs="Poppins" w:eastAsia="Poppins" w:hAnsi="Poppins"/>
+          <w:color w:val="1A1A1A"/>
+          <w:sz w:val="20"/>
+          <w:szCs w:val="20"/>
+        </w:rPr>
+        <w:t xml:space="preserve">Together they compound: better briefs expose missing context, skills capture it, and a shared record lets the whole team start from everyone's best work. Every rule in this standard is a compounded lesson of that kind, a failure recorded once and then reused (Appendix B).</w:t>
+      </w:r>
+    </w:p>
+    <w:p>
+      <w:r>
+        <w:br w:type="page"/>
       </w:r>
     </w:p>
     <w:p>

</xml_diff>